<commit_message>
Signed-off-by: svahsek <ks@keshavs.com> eSignet deployment guide - crude
</commit_message>
<xml_diff>
--- a/docs/build-and-deploy/deployment-arch/es-deployment-guide-1.docx
+++ b/docs/build-and-deploy/deployment-arch/es-deployment-guide-1.docx
@@ -2,7 +2,7 @@
 <file path=word/document.xml><?xml version="1.0" encoding="utf-8"?>
 <w:document xmlns:w="http://schemas.openxmlformats.org/wordprocessingml/2006/main" xmlns:m="http://schemas.openxmlformats.org/officeDocument/2006/math" xmlns:r="http://schemas.openxmlformats.org/officeDocument/2006/relationships" xmlns:o="urn:schemas-microsoft-com:office:office" xmlns:v="urn:schemas-microsoft-com:vml" xmlns:w10="urn:schemas-microsoft-com:office:word" xmlns:a="http://schemas.openxmlformats.org/drawingml/2006/main" xmlns:pic="http://schemas.openxmlformats.org/drawingml/2006/picture" xmlns:wp="http://schemas.openxmlformats.org/drawingml/2006/wordprocessingDrawing">
   <w:body>
-    <w:bookmarkStart w:id="17" w:name="overview"/>
+    <w:bookmarkStart w:id="11" w:name="overview"/>
     <w:p>
       <w:pPr>
         <w:pStyle w:val="Heading2"/>
@@ -123,7 +123,7 @@
       </w:r>
     </w:p>
     <w:bookmarkEnd w:id="9"/>
-    <w:bookmarkStart w:id="16" w:name="Xdb1ffa87e7a1b3b2dec88b53eb19229c2cfd037"/>
+    <w:bookmarkStart w:id="10" w:name="Xdb1ffa87e7a1b3b2dec88b53eb19229c2cfd037"/>
     <w:p>
       <w:pPr>
         <w:pStyle w:val="Heading3"/>
@@ -140,7 +140,7 @@
           <w:numId w:val="1002"/>
         </w:numPr>
       </w:pPr>
-      <w:hyperlink r:id="rId10">
+      <w:hyperlink w:anchor="overview">
         <w:r>
           <w:rPr>
             <w:rStyle w:val="Hyperlink"/>
@@ -162,7 +162,7 @@
           <w:numId w:val="1002"/>
         </w:numPr>
       </w:pPr>
-      <w:hyperlink r:id="rId11">
+      <w:hyperlink w:anchor="prerequisites">
         <w:r>
           <w:rPr>
             <w:rStyle w:val="Hyperlink"/>
@@ -184,29 +184,7 @@
           <w:numId w:val="1002"/>
         </w:numPr>
       </w:pPr>
-      <w:hyperlink r:id="rId12">
-        <w:r>
-          <w:rPr>
-            <w:rStyle w:val="Hyperlink"/>
-            <w:b/>
-            <w:bCs/>
-          </w:rPr>
-          <w:t xml:space="preserve">Infrastructure</w:t>
-        </w:r>
-      </w:hyperlink>
-      <w:r>
-        <w:t xml:space="preserve">: This section assumes that a Kubernetes-based environment is already set up and ready for deploying eSignet. Or it expects you have the ID system already deployed on a kubernettes based infra and next to which you will be deploying eSignet.</w:t>
-      </w:r>
-    </w:p>
-    <w:p>
-      <w:pPr>
-        <w:pStyle w:val="Compact"/>
-        <w:numPr>
-          <w:ilvl w:val="0"/>
-          <w:numId w:val="1002"/>
-        </w:numPr>
-      </w:pPr>
-      <w:hyperlink r:id="rId13">
+      <w:hyperlink w:anchor="deploy-esignet">
         <w:r>
           <w:rPr>
             <w:rStyle w:val="Hyperlink"/>
@@ -243,7 +221,7 @@
           <w:numId w:val="1002"/>
         </w:numPr>
       </w:pPr>
-      <w:hyperlink r:id="rId14">
+      <w:hyperlink w:anchor="deploy-esignet-services">
         <w:r>
           <w:rPr>
             <w:rStyle w:val="Hyperlink"/>
@@ -271,7 +249,7 @@
           <w:numId w:val="1002"/>
         </w:numPr>
       </w:pPr>
-      <w:hyperlink r:id="rId15">
+      <w:hyperlink w:anchor="link">
         <w:r>
           <w:rPr>
             <w:rStyle w:val="Hyperlink"/>
@@ -293,9 +271,9 @@
         <w:t xml:space="preserve">Each section provides direct steps and references to external resources for a streamlined deployment experience.</w:t>
       </w:r>
     </w:p>
-    <w:bookmarkEnd w:id="16"/>
-    <w:bookmarkEnd w:id="17"/>
-    <w:bookmarkStart w:id="19" w:name="X4227b40ff6fcf0febe15fe16af4ba5c3216cdc7"/>
+    <w:bookmarkEnd w:id="10"/>
+    <w:bookmarkEnd w:id="11"/>
+    <w:bookmarkStart w:id="12" w:name="X4227b40ff6fcf0febe15fe16af4ba5c3216cdc7"/>
     <w:p>
       <w:pPr>
         <w:pStyle w:val="Heading2"/>
@@ -330,7 +308,7 @@
       <w:r>
         <w:t xml:space="preserve"> </w:t>
       </w:r>
-      <w:hyperlink r:id="rId18">
+      <w:hyperlink w:anchor="deploy-esignet-services">
         <w:r>
           <w:rPr>
             <w:rStyle w:val="Hyperlink"/>
@@ -355,7 +333,6 @@
     </w:p>
     <w:p>
       <w:pPr>
-        <w:pStyle w:val="Compact"/>
         <w:numPr>
           <w:ilvl w:val="0"/>
           <w:numId w:val="1003"/>
@@ -374,7 +351,10 @@
     </w:p>
     <w:p>
       <w:pPr>
-        <w:pStyle w:val="FirstParagraph"/>
+        <w:numPr>
+          <w:ilvl w:val="0"/>
+          <w:numId w:val="1000"/>
+        </w:numPr>
       </w:pPr>
       <w:r>
         <w:t xml:space="preserve">This scenario deploys eSignet with a mock identity provider, allowing you to simulate authentication and authorization flows without integrating with a real ID system. It is ideal for development, testing, and demonstrations, requiring no external dependencies or onboarding steps.</w:t>
@@ -382,10 +362,9 @@
     </w:p>
     <w:p>
       <w:pPr>
-        <w:pStyle w:val="Compact"/>
-        <w:numPr>
-          <w:ilvl w:val="0"/>
-          <w:numId w:val="1004"/>
+        <w:numPr>
+          <w:ilvl w:val="0"/>
+          <w:numId w:val="1003"/>
         </w:numPr>
       </w:pPr>
       <w:r>
@@ -401,7 +380,10 @@
     </w:p>
     <w:p>
       <w:pPr>
-        <w:pStyle w:val="FirstParagraph"/>
+        <w:numPr>
+          <w:ilvl w:val="0"/>
+          <w:numId w:val="1000"/>
+        </w:numPr>
       </w:pPr>
       <w:r>
         <w:t xml:space="preserve">eSignet + MOSIP refers to integrating eSignet with the MOSIP identity system. In this scenario, eSignet leverages MOSIP as the identity provider, enabling secure authentication and digital signature workflows based on MOSIP-managed identities. This setup is suitable for environments where MOSIP is already deployed or planned, ensuring seamless identity verification and trust.</w:t>
@@ -411,7 +393,7 @@
       <w:pPr>
         <w:numPr>
           <w:ilvl w:val="0"/>
-          <w:numId w:val="1005"/>
+          <w:numId w:val="1003"/>
         </w:numPr>
       </w:pPr>
       <w:r>
@@ -440,7 +422,7 @@
       <w:pPr>
         <w:numPr>
           <w:ilvl w:val="0"/>
-          <w:numId w:val="1005"/>
+          <w:numId w:val="1003"/>
         </w:numPr>
       </w:pPr>
       <w:r>
@@ -456,7 +438,7 @@
         <w:pStyle w:val="Compact"/>
         <w:numPr>
           <w:ilvl w:val="1"/>
-          <w:numId w:val="1006"/>
+          <w:numId w:val="1004"/>
         </w:numPr>
       </w:pPr>
       <w:r>
@@ -474,8 +456,8 @@
         <w:t xml:space="preserve">This scenario focuses on integrating eSignet with the Sunbird RC identity system. It enables eSignet to utilize Sunbird RC for identity management, facilitating secure authentication and digital signature processes. This setup is particularly beneficial for organizations that have already implemented Sunbird RC, allowing them to enhance their identity verification and trust mechanisms with eSignet’s features.</w:t>
       </w:r>
     </w:p>
-    <w:bookmarkEnd w:id="19"/>
-    <w:bookmarkStart w:id="31" w:name="prerequisites"/>
+    <w:bookmarkEnd w:id="12"/>
+    <w:bookmarkStart w:id="24" w:name="prerequisites"/>
     <w:p>
       <w:pPr>
         <w:pStyle w:val="Heading1"/>
@@ -505,7 +487,7 @@
           <w:b/>
           <w:bCs/>
         </w:rPr>
-        <w:t xml:space="preserve">Personal Computer</w:t>
+        <w:t xml:space="preserve">Developer Workstation Profile</w:t>
       </w:r>
       <w:r>
         <w:t xml:space="preserve">: This section lists the tools and utilities you need to have installed on your personal computer to create/manage the k8’s cluster and deploy eSignet on it.</w:t>
@@ -524,27 +506,16 @@
           <w:b/>
           <w:bCs/>
         </w:rPr>
-        <w:t xml:space="preserve">Server Requirements</w:t>
-      </w:r>
-      <w:r>
-        <w:t xml:space="preserve">: This section lists the hardware/software/network requirements for the Kubernetes based server infrastructure where you will deploy eSignet.</w:t>
-      </w:r>
-    </w:p>
-    <w:bookmarkStart w:id="29" w:name="pc-requirements-and-environment"/>
-    <w:p>
-      <w:pPr>
-        <w:pStyle w:val="Heading2"/>
-      </w:pPr>
-      <w:r>
-        <w:t xml:space="preserve">PC Requirements and Environment</w:t>
-      </w:r>
-    </w:p>
-    <w:p>
-      <w:pPr>
-        <w:pStyle w:val="FirstParagraph"/>
-      </w:pPr>
-      <w:r>
-        <w:t xml:space="preserve">The</w:t>
+        <w:t xml:space="preserve">Developer Environment Setup</w:t>
+      </w:r>
+      <w:r>
+        <w:t xml:space="preserve">: This section lists the specific configurations and settings required for your development environment to work effectively with eSignet.</w:t>
+      </w:r>
+      <w:r>
+        <w:t xml:space="preserve"> </w:t>
+      </w:r>
+      <w:r>
+        <w:t xml:space="preserve">*</w:t>
       </w:r>
       <w:r>
         <w:t xml:space="preserve"> </w:t>
@@ -554,22 +525,19 @@
           <w:b/>
           <w:bCs/>
         </w:rPr>
-        <w:t xml:space="preserve">Personal Computer Prerequisites</w:t>
-      </w:r>
-      <w:r>
-        <w:t xml:space="preserve"> </w:t>
-      </w:r>
-      <w:r>
-        <w:t xml:space="preserve">lists the common tools and utilities which you will need to have installed on your personal computer to be able to create/manage the k8’s cluster and deploy eSignet on it.</w:t>
-      </w:r>
-    </w:p>
-    <w:bookmarkStart w:id="20" w:name="operating-systems"/>
-    <w:p>
-      <w:pPr>
-        <w:pStyle w:val="Heading3"/>
-      </w:pPr>
-      <w:r>
-        <w:t xml:space="preserve">Operating Systems</w:t>
+        <w:t xml:space="preserve">Cloud Environment Profile</w:t>
+      </w:r>
+      <w:r>
+        <w:t xml:space="preserve">: This section lists the hardware/software/network requirements for the Kubernetes based server infrastructure where you will deploy eSignet.</w:t>
+      </w:r>
+    </w:p>
+    <w:bookmarkStart w:id="22" w:name="developer-workstation-profile"/>
+    <w:p>
+      <w:pPr>
+        <w:pStyle w:val="Heading2"/>
+      </w:pPr>
+      <w:r>
+        <w:t xml:space="preserve">Developer Workstation Profile</w:t>
       </w:r>
     </w:p>
     <w:p>
@@ -577,29 +545,40 @@
         <w:pStyle w:val="FirstParagraph"/>
       </w:pPr>
       <w:r>
-        <w:t xml:space="preserve">The eSignet can be deployed with a PC having one of the following operating systems, however for this guide we have considered a linux machine with Ubuntu 22.04 LTS.</w:t>
-      </w:r>
-    </w:p>
-    <w:p>
-      <w:pPr>
-        <w:pStyle w:val="Compact"/>
-        <w:numPr>
-          <w:ilvl w:val="0"/>
-          <w:numId w:val="1007"/>
-        </w:numPr>
-      </w:pPr>
+        <w:t xml:space="preserve">The</w:t>
+      </w:r>
+      <w:r>
+        <w:t xml:space="preserve"> </w:t>
+      </w:r>
       <w:r>
         <w:rPr>
           <w:b/>
           <w:bCs/>
         </w:rPr>
-        <w:t xml:space="preserve">Linux</w:t>
-      </w:r>
-      <w:r>
-        <w:t xml:space="preserve"> </w:t>
-      </w:r>
-      <w:r>
-        <w:t xml:space="preserve">(Ubuntu 22.04 LTS - recommended for production deployments)</w:t>
+        <w:t xml:space="preserve">Developer Workstation Profile</w:t>
+      </w:r>
+      <w:r>
+        <w:t xml:space="preserve"> </w:t>
+      </w:r>
+      <w:r>
+        <w:t xml:space="preserve">lists the common tools and utilities which you will need to have installed on your personal computer to be able to create/manage the k8’s cluster and deploy eSignet on it.</w:t>
+      </w:r>
+    </w:p>
+    <w:bookmarkStart w:id="13" w:name="operating-systems"/>
+    <w:p>
+      <w:pPr>
+        <w:pStyle w:val="Heading3"/>
+      </w:pPr>
+      <w:r>
+        <w:t xml:space="preserve">Operating Systems</w:t>
+      </w:r>
+    </w:p>
+    <w:p>
+      <w:pPr>
+        <w:pStyle w:val="FirstParagraph"/>
+      </w:pPr>
+      <w:r>
+        <w:t xml:space="preserve">The eSignet can be deployed with a PC having one of the following operating systems, however for this guide we have considered a linux machine with Ubuntu 22.04 LTS.</w:t>
       </w:r>
     </w:p>
     <w:p>
@@ -607,7 +586,7 @@
         <w:pStyle w:val="Compact"/>
         <w:numPr>
           <w:ilvl w:val="0"/>
-          <w:numId w:val="1007"/>
+          <w:numId w:val="1005"/>
         </w:numPr>
       </w:pPr>
       <w:r>
@@ -615,7 +594,13 @@
           <w:b/>
           <w:bCs/>
         </w:rPr>
-        <w:t xml:space="preserve">Windows</w:t>
+        <w:t xml:space="preserve">Linux</w:t>
+      </w:r>
+      <w:r>
+        <w:t xml:space="preserve"> </w:t>
+      </w:r>
+      <w:r>
+        <w:t xml:space="preserve">(Ubuntu 22.04 LTS - recommended for production deployments)</w:t>
       </w:r>
     </w:p>
     <w:p>
@@ -623,7 +608,7 @@
         <w:pStyle w:val="Compact"/>
         <w:numPr>
           <w:ilvl w:val="0"/>
-          <w:numId w:val="1007"/>
+          <w:numId w:val="1005"/>
         </w:numPr>
       </w:pPr>
       <w:r>
@@ -631,6 +616,22 @@
           <w:b/>
           <w:bCs/>
         </w:rPr>
+        <w:t xml:space="preserve">Windows</w:t>
+      </w:r>
+    </w:p>
+    <w:p>
+      <w:pPr>
+        <w:pStyle w:val="Compact"/>
+        <w:numPr>
+          <w:ilvl w:val="0"/>
+          <w:numId w:val="1005"/>
+        </w:numPr>
+      </w:pPr>
+      <w:r>
+        <w:rPr>
+          <w:b/>
+          <w:bCs/>
+        </w:rPr>
         <w:t xml:space="preserve">macOS (OSX)</w:t>
       </w:r>
     </w:p>
@@ -654,14 +655,14 @@
         <w:t xml:space="preserve">%}</w:t>
       </w:r>
     </w:p>
-    <w:bookmarkEnd w:id="20"/>
-    <w:bookmarkStart w:id="28" w:name="tools-and-utilities"/>
+    <w:bookmarkEnd w:id="13"/>
+    <w:bookmarkStart w:id="21" w:name="development-environment-setup"/>
     <w:p>
       <w:pPr>
         <w:pStyle w:val="Heading3"/>
       </w:pPr>
       <w:r>
-        <w:t xml:space="preserve">Tools and Utilities</w:t>
+        <w:t xml:space="preserve">Development Environment Setup</w:t>
       </w:r>
     </w:p>
     <w:p>
@@ -677,10 +678,10 @@
         <w:pStyle w:val="Compact"/>
         <w:numPr>
           <w:ilvl w:val="0"/>
-          <w:numId w:val="1008"/>
-        </w:numPr>
-      </w:pPr>
-      <w:hyperlink r:id="rId21">
+          <w:numId w:val="1006"/>
+        </w:numPr>
+      </w:pPr>
+      <w:hyperlink r:id="rId14">
         <w:r>
           <w:rPr>
             <w:rStyle w:val="Hyperlink"/>
@@ -700,7 +701,7 @@
         <w:pStyle w:val="Compact"/>
         <w:numPr>
           <w:ilvl w:val="0"/>
-          <w:numId w:val="1008"/>
+          <w:numId w:val="1006"/>
         </w:numPr>
       </w:pPr>
       <w:r>
@@ -712,10 +713,10 @@
         <w:pStyle w:val="Compact"/>
         <w:numPr>
           <w:ilvl w:val="1"/>
-          <w:numId w:val="1009"/>
-        </w:numPr>
-      </w:pPr>
-      <w:hyperlink r:id="rId22">
+          <w:numId w:val="1007"/>
+        </w:numPr>
+      </w:pPr>
+      <w:hyperlink r:id="rId15">
         <w:r>
           <w:rPr>
             <w:rStyle w:val="Hyperlink"/>
@@ -732,10 +733,10 @@
         <w:pStyle w:val="Compact"/>
         <w:numPr>
           <w:ilvl w:val="1"/>
-          <w:numId w:val="1009"/>
-        </w:numPr>
-      </w:pPr>
-      <w:hyperlink r:id="rId23">
+          <w:numId w:val="1007"/>
+        </w:numPr>
+      </w:pPr>
+      <w:hyperlink r:id="rId16">
         <w:r>
           <w:rPr>
             <w:rStyle w:val="Hyperlink"/>
@@ -772,10 +773,10 @@
         <w:pStyle w:val="Compact"/>
         <w:numPr>
           <w:ilvl w:val="0"/>
-          <w:numId w:val="1010"/>
-        </w:numPr>
-      </w:pPr>
-      <w:hyperlink r:id="rId24">
+          <w:numId w:val="1008"/>
+        </w:numPr>
+      </w:pPr>
+      <w:hyperlink r:id="rId17">
         <w:r>
           <w:rPr>
             <w:rStyle w:val="Hyperlink"/>
@@ -792,7 +793,7 @@
       <w:r>
         <w:t xml:space="preserve"> </w:t>
       </w:r>
-      <w:hyperlink r:id="rId25">
+      <w:hyperlink r:id="rId18">
         <w:r>
           <w:rPr>
             <w:rStyle w:val="Hyperlink"/>
@@ -806,10 +807,10 @@
         <w:pStyle w:val="Compact"/>
         <w:numPr>
           <w:ilvl w:val="0"/>
-          <w:numId w:val="1010"/>
-        </w:numPr>
-      </w:pPr>
-      <w:hyperlink r:id="rId26">
+          <w:numId w:val="1008"/>
+        </w:numPr>
+      </w:pPr>
+      <w:hyperlink r:id="rId19">
         <w:r>
           <w:rPr>
             <w:rStyle w:val="Hyperlink"/>
@@ -829,7 +830,7 @@
         <w:pStyle w:val="Compact"/>
         <w:numPr>
           <w:ilvl w:val="0"/>
-          <w:numId w:val="1010"/>
+          <w:numId w:val="1008"/>
         </w:numPr>
       </w:pPr>
       <w:r>
@@ -838,7 +839,7 @@
       <w:r>
         <w:t xml:space="preserve"> </w:t>
       </w:r>
-      <w:hyperlink r:id="rId27">
+      <w:hyperlink r:id="rId20">
         <w:r>
           <w:rPr>
             <w:rStyle w:val="Hyperlink"/>
@@ -853,15 +854,15 @@
         <w:t xml:space="preserve">section for the instructions.</w:t>
       </w:r>
     </w:p>
-    <w:bookmarkEnd w:id="28"/>
-    <w:bookmarkEnd w:id="29"/>
-    <w:bookmarkStart w:id="30" w:name="server-requirements-and-environment"/>
+    <w:bookmarkEnd w:id="21"/>
+    <w:bookmarkEnd w:id="22"/>
+    <w:bookmarkStart w:id="23" w:name="cloud-environment-profile"/>
     <w:p>
       <w:pPr>
         <w:pStyle w:val="Heading2"/>
       </w:pPr>
       <w:r>
-        <w:t xml:space="preserve">Server Requirements and Environment</w:t>
+        <w:t xml:space="preserve">Cloud Environment Profile</w:t>
       </w:r>
     </w:p>
     <w:p>
@@ -879,9 +880,9 @@
         <w:t xml:space="preserve">: Kubernetes based server infrastructure is required to deploy eSignet. It can either have the Identity System (like MOSIP) already deployed on it or you can deploy eSignet along with the ID system.</w:t>
       </w:r>
     </w:p>
-    <w:bookmarkEnd w:id="30"/>
-    <w:bookmarkEnd w:id="31"/>
-    <w:bookmarkStart w:id="64" w:name="deploy-esignet"/>
+    <w:bookmarkEnd w:id="23"/>
+    <w:bookmarkEnd w:id="24"/>
+    <w:bookmarkStart w:id="57" w:name="deploy-esignet"/>
     <w:p>
       <w:pPr>
         <w:pStyle w:val="Heading1"/>
@@ -916,7 +917,7 @@
       <w:pPr>
         <w:numPr>
           <w:ilvl w:val="0"/>
-          <w:numId w:val="1011"/>
+          <w:numId w:val="1009"/>
         </w:numPr>
       </w:pPr>
       <w:r>
@@ -934,7 +935,7 @@
       <w:pPr>
         <w:numPr>
           <w:ilvl w:val="0"/>
-          <w:numId w:val="1011"/>
+          <w:numId w:val="1009"/>
         </w:numPr>
       </w:pPr>
       <w:r>
@@ -976,7 +977,7 @@
       <w:pPr>
         <w:numPr>
           <w:ilvl w:val="0"/>
-          <w:numId w:val="1011"/>
+          <w:numId w:val="1009"/>
         </w:numPr>
       </w:pPr>
       <w:r>
@@ -994,7 +995,7 @@
       <w:pPr>
         <w:numPr>
           <w:ilvl w:val="0"/>
-          <w:numId w:val="1011"/>
+          <w:numId w:val="1009"/>
         </w:numPr>
       </w:pPr>
       <w:r>
@@ -1012,7 +1013,7 @@
       <w:pPr>
         <w:numPr>
           <w:ilvl w:val="0"/>
-          <w:numId w:val="1011"/>
+          <w:numId w:val="1009"/>
         </w:numPr>
       </w:pPr>
       <w:r>
@@ -1030,7 +1031,7 @@
       <w:pPr>
         <w:numPr>
           <w:ilvl w:val="0"/>
-          <w:numId w:val="1011"/>
+          <w:numId w:val="1009"/>
         </w:numPr>
       </w:pPr>
       <w:r>
@@ -1048,7 +1049,7 @@
       <w:pPr>
         <w:numPr>
           <w:ilvl w:val="0"/>
-          <w:numId w:val="1011"/>
+          <w:numId w:val="1009"/>
         </w:numPr>
       </w:pPr>
       <w:r>
@@ -1070,7 +1071,7 @@
         <w:t xml:space="preserve">Follow the subsections below for detailed instructions</w:t>
       </w:r>
     </w:p>
-    <w:bookmarkStart w:id="32" w:name="X5f0d2a6ae0023da5c1d3cc4de15df5c8d847695"/>
+    <w:bookmarkStart w:id="25" w:name="X5f0d2a6ae0023da5c1d3cc4de15df5c8d847695"/>
     <w:p>
       <w:pPr>
         <w:pStyle w:val="Heading2"/>
@@ -1159,8 +1160,8 @@
         <w:t xml:space="preserve">* Access to any required secrets or configuration files.</w:t>
       </w:r>
     </w:p>
-    <w:bookmarkEnd w:id="32"/>
-    <w:bookmarkStart w:id="33" w:name="request-devops-team-for-below-items"/>
+    <w:bookmarkEnd w:id="25"/>
+    <w:bookmarkStart w:id="26" w:name="request-devops-team-for-below-items"/>
     <w:p>
       <w:pPr>
         <w:pStyle w:val="Heading2"/>
@@ -1173,7 +1174,7 @@
       <w:pPr>
         <w:numPr>
           <w:ilvl w:val="0"/>
-          <w:numId w:val="1012"/>
+          <w:numId w:val="1010"/>
         </w:numPr>
       </w:pPr>
       <w:r>
@@ -1184,7 +1185,7 @@
       <w:pPr>
         <w:numPr>
           <w:ilvl w:val="0"/>
-          <w:numId w:val="1012"/>
+          <w:numId w:val="1010"/>
         </w:numPr>
       </w:pPr>
       <w:r>
@@ -1195,7 +1196,7 @@
       <w:pPr>
         <w:numPr>
           <w:ilvl w:val="0"/>
-          <w:numId w:val="1012"/>
+          <w:numId w:val="1010"/>
         </w:numPr>
       </w:pPr>
       <w:r>
@@ -1272,17 +1273,144 @@
         </w:rPr>
         <w:t xml:space="preserve"> kubeconfig ~/.kube/config</w:t>
       </w:r>
-    </w:p>
-    <w:p>
-      <w:pPr>
-        <w:pStyle w:val="Compact"/>
-        <w:numPr>
-          <w:ilvl w:val="0"/>
-          <w:numId w:val="1013"/>
-        </w:numPr>
-      </w:pPr>
-      <w:r>
-        <w:t xml:space="preserve">Check cluster context</w:t>
+      <w:r>
+        <w:br/>
+      </w:r>
+      <w:r>
+        <w:br/>
+      </w:r>
+      <w:r>
+        <w:rPr>
+          <w:rStyle w:val="KeywordTok"/>
+        </w:rPr>
+        <w:t xml:space="preserve">```</w:t>
+      </w:r>
+      <w:r>
+        <w:rPr>
+          <w:rStyle w:val="FunctionTok"/>
+        </w:rPr>
+        <w:t xml:space="preserve">sh</w:t>
+      </w:r>
+      <w:r>
+        <w:br/>
+      </w:r>
+      <w:r>
+        <w:rPr>
+          <w:rStyle w:val="ExtensionTok"/>
+        </w:rPr>
+        <w:t xml:space="preserve">*</w:t>
+      </w:r>
+      <w:r>
+        <w:rPr>
+          <w:rStyle w:val="NormalTok"/>
+        </w:rPr>
+        <w:t xml:space="preserve"> Check cluster context</w:t>
+      </w:r>
+      <w:r>
+        <w:br/>
+      </w:r>
+      <w:r>
+        <w:br/>
+      </w:r>
+      <w:r>
+        <w:rPr>
+          <w:rStyle w:val="CommentTok"/>
+        </w:rPr>
+        <w:t xml:space="preserve"># Confirm you are operating in the correct cluster context:</w:t>
+      </w:r>
+      <w:r>
+        <w:br/>
+      </w:r>
+      <w:r>
+        <w:rPr>
+          <w:rStyle w:val="ExtensionTok"/>
+        </w:rPr>
+        <w:t xml:space="preserve">kubectl</w:t>
+      </w:r>
+      <w:r>
+        <w:rPr>
+          <w:rStyle w:val="NormalTok"/>
+        </w:rPr>
+        <w:t xml:space="preserve"> config get-contexts</w:t>
+      </w:r>
+      <w:r>
+        <w:br/>
+      </w:r>
+      <w:r>
+        <w:rPr>
+          <w:rStyle w:val="ExtensionTok"/>
+        </w:rPr>
+        <w:t xml:space="preserve">kubectl</w:t>
+      </w:r>
+      <w:r>
+        <w:rPr>
+          <w:rStyle w:val="NormalTok"/>
+        </w:rPr>
+        <w:t xml:space="preserve"> config use-context </w:t>
+      </w:r>
+      <w:r>
+        <w:rPr>
+          <w:rStyle w:val="OperatorTok"/>
+        </w:rPr>
+        <w:t xml:space="preserve">&lt;</w:t>
+      </w:r>
+      <w:r>
+        <w:rPr>
+          <w:rStyle w:val="NormalTok"/>
+        </w:rPr>
+        <w:t xml:space="preserve">desired-context</w:t>
+      </w:r>
+      <w:r>
+        <w:rPr>
+          <w:rStyle w:val="OperatorTok"/>
+        </w:rPr>
+        <w:t xml:space="preserve">&gt;</w:t>
+      </w:r>
+    </w:p>
+    <w:p>
+      <w:pPr>
+        <w:pStyle w:val="BlockText"/>
+      </w:pPr>
+      <w:r>
+        <w:t xml:space="preserve">Note: Above mentioned environment variables will be used throughout the installation to move between one directory to other to run install scripts.</w:t>
+      </w:r>
+    </w:p>
+    <w:bookmarkEnd w:id="26"/>
+    <w:bookmarkStart w:id="27" w:name="Xf8df0127c3d7c73c3dec61ca496766e97d8aecf"/>
+    <w:p>
+      <w:pPr>
+        <w:pStyle w:val="Heading2"/>
+      </w:pPr>
+      <w:r>
+        <w:t xml:space="preserve">Verify existing</w:t>
+      </w:r>
+      <w:r>
+        <w:t xml:space="preserve"> </w:t>
+      </w:r>
+      <w:r>
+        <w:t xml:space="preserve">‘ID System’</w:t>
+      </w:r>
+      <w:r>
+        <w:t xml:space="preserve"> </w:t>
+      </w:r>
+      <w:r>
+        <w:t xml:space="preserve">next to which you will deploy eSignet</w:t>
+      </w:r>
+    </w:p>
+    <w:p>
+      <w:pPr>
+        <w:pStyle w:val="FirstParagraph"/>
+      </w:pPr>
+      <w:r>
+        <w:t xml:space="preserve">In case you are deploying eSignet with an ID System (like MOSIP), you should first validate that the existing ID System is healthy and operational, after which you can deploy.</w:t>
+      </w:r>
+    </w:p>
+    <w:p>
+      <w:pPr>
+        <w:pStyle w:val="BodyText"/>
+      </w:pPr>
+      <w:r>
+        <w:t xml:space="preserve">We have considered MOSIP for an example and scope of this document.</w:t>
       </w:r>
     </w:p>
     <w:p>
@@ -1293,7 +1421,7 @@
         <w:rPr>
           <w:rStyle w:val="CommentTok"/>
         </w:rPr>
-        <w:t xml:space="preserve"># Confirm you are operating in the correct cluster context:</w:t>
+        <w:t xml:space="preserve"># Test cluster connectivity</w:t>
       </w:r>
       <w:r>
         <w:br/>
@@ -1308,12 +1436,24 @@
         <w:rPr>
           <w:rStyle w:val="NormalTok"/>
         </w:rPr>
-        <w:t xml:space="preserve"> config get-contexts</w:t>
+        <w:t xml:space="preserve"> get nodes</w:t>
       </w:r>
       <w:r>
         <w:br/>
       </w:r>
       <w:r>
+        <w:br/>
+      </w:r>
+      <w:r>
+        <w:rPr>
+          <w:rStyle w:val="CommentTok"/>
+        </w:rPr>
+        <w:t xml:space="preserve"># Check MOSIP deployment status</w:t>
+      </w:r>
+      <w:r>
+        <w:br/>
+      </w:r>
+      <w:r>
         <w:rPr>
           <w:rStyle w:val="ExtensionTok"/>
         </w:rPr>
@@ -1323,7 +1463,19 @@
         <w:rPr>
           <w:rStyle w:val="NormalTok"/>
         </w:rPr>
-        <w:t xml:space="preserve"> config use-context </w:t>
+        <w:t xml:space="preserve"> get pods </w:t>
+      </w:r>
+      <w:r>
+        <w:rPr>
+          <w:rStyle w:val="AttributeTok"/>
+        </w:rPr>
+        <w:t xml:space="preserve">-n</w:t>
+      </w:r>
+      <w:r>
+        <w:rPr>
+          <w:rStyle w:val="NormalTok"/>
+        </w:rPr>
+        <w:t xml:space="preserve"> </w:t>
       </w:r>
       <w:r>
         <w:rPr>
@@ -1335,7 +1487,7 @@
         <w:rPr>
           <w:rStyle w:val="NormalTok"/>
         </w:rPr>
-        <w:t xml:space="preserve">desired-context</w:t>
+        <w:t xml:space="preserve">namespace</w:t>
       </w:r>
       <w:r>
         <w:rPr>
@@ -1343,35 +1495,259 @@
         </w:rPr>
         <w:t xml:space="preserve">&gt;</w:t>
       </w:r>
+      <w:r>
+        <w:br/>
+      </w:r>
+      <w:r>
+        <w:rPr>
+          <w:rStyle w:val="ExtensionTok"/>
+        </w:rPr>
+        <w:t xml:space="preserve">kubectl</w:t>
+      </w:r>
+      <w:r>
+        <w:rPr>
+          <w:rStyle w:val="NormalTok"/>
+        </w:rPr>
+        <w:t xml:space="preserve"> get svc </w:t>
+      </w:r>
+      <w:r>
+        <w:rPr>
+          <w:rStyle w:val="AttributeTok"/>
+        </w:rPr>
+        <w:t xml:space="preserve">-n</w:t>
+      </w:r>
+      <w:r>
+        <w:rPr>
+          <w:rStyle w:val="NormalTok"/>
+        </w:rPr>
+        <w:t xml:space="preserve"> </w:t>
+      </w:r>
+      <w:r>
+        <w:rPr>
+          <w:rStyle w:val="OperatorTok"/>
+        </w:rPr>
+        <w:t xml:space="preserve">&lt;</w:t>
+      </w:r>
+      <w:r>
+        <w:rPr>
+          <w:rStyle w:val="NormalTok"/>
+        </w:rPr>
+        <w:t xml:space="preserve">namespace</w:t>
+      </w:r>
+      <w:r>
+        <w:rPr>
+          <w:rStyle w:val="OperatorTok"/>
+        </w:rPr>
+        <w:t xml:space="preserve">&gt;</w:t>
+      </w:r>
+      <w:r>
+        <w:br/>
+      </w:r>
+      <w:r>
+        <w:br/>
+      </w:r>
+      <w:r>
+        <w:rPr>
+          <w:rStyle w:val="CommentTok"/>
+        </w:rPr>
+        <w:t xml:space="preserve"># Verify key MOSIP services are running</w:t>
+      </w:r>
+      <w:r>
+        <w:br/>
+      </w:r>
+      <w:r>
+        <w:rPr>
+          <w:rStyle w:val="ExtensionTok"/>
+        </w:rPr>
+        <w:t xml:space="preserve">kubectl</w:t>
+      </w:r>
+      <w:r>
+        <w:rPr>
+          <w:rStyle w:val="NormalTok"/>
+        </w:rPr>
+        <w:t xml:space="preserve"> get pods </w:t>
+      </w:r>
+      <w:r>
+        <w:rPr>
+          <w:rStyle w:val="AttributeTok"/>
+        </w:rPr>
+        <w:t xml:space="preserve">-n</w:t>
+      </w:r>
+      <w:r>
+        <w:rPr>
+          <w:rStyle w:val="NormalTok"/>
+        </w:rPr>
+        <w:t xml:space="preserve"> mosip </w:t>
+      </w:r>
+      <w:r>
+        <w:rPr>
+          <w:rStyle w:val="KeywordTok"/>
+        </w:rPr>
+        <w:t xml:space="preserve">|</w:t>
+      </w:r>
+      <w:r>
+        <w:rPr>
+          <w:rStyle w:val="NormalTok"/>
+        </w:rPr>
+        <w:t xml:space="preserve"> </w:t>
+      </w:r>
+      <w:r>
+        <w:rPr>
+          <w:rStyle w:val="FunctionTok"/>
+        </w:rPr>
+        <w:t xml:space="preserve">grep</w:t>
+      </w:r>
+      <w:r>
+        <w:rPr>
+          <w:rStyle w:val="NormalTok"/>
+        </w:rPr>
+        <w:t xml:space="preserve"> </w:t>
+      </w:r>
+      <w:r>
+        <w:rPr>
+          <w:rStyle w:val="AttributeTok"/>
+        </w:rPr>
+        <w:t xml:space="preserve">-E</w:t>
+      </w:r>
+      <w:r>
+        <w:rPr>
+          <w:rStyle w:val="NormalTok"/>
+        </w:rPr>
+        <w:t xml:space="preserve"> </w:t>
+      </w:r>
+      <w:r>
+        <w:rPr>
+          <w:rStyle w:val="StringTok"/>
+        </w:rPr>
+        <w:t xml:space="preserve">"(ida|pms|kernel|postgres|keycloak|redis)"</w:t>
+      </w:r>
+    </w:p>
+    <w:bookmarkEnd w:id="27"/>
+    <w:bookmarkStart w:id="28" w:name="clone-esignet-repository"/>
+    <w:p>
+      <w:pPr>
+        <w:pStyle w:val="Heading2"/>
+      </w:pPr>
+      <w:r>
+        <w:t xml:space="preserve">Clone eSignet Repository</w:t>
+      </w:r>
+    </w:p>
+    <w:p>
+      <w:pPr>
+        <w:pStyle w:val="FirstParagraph"/>
+      </w:pPr>
+      <w:r>
+        <w:t xml:space="preserve">This allows you to access the deployment scripts and configuration files required for installing eSignet.</w:t>
+      </w:r>
     </w:p>
     <w:p>
       <w:pPr>
         <w:pStyle w:val="BlockText"/>
       </w:pPr>
       <w:r>
-        <w:t xml:space="preserve">Note: Above mentioned environment variables will be used throughout the installation to move between one directory to other to run install scripts.</w:t>
-      </w:r>
-    </w:p>
-    <w:bookmarkEnd w:id="33"/>
-    <w:bookmarkStart w:id="34" w:name="Xf8df0127c3d7c73c3dec61ca496766e97d8aecf"/>
+        <w:t xml:space="preserve">Note: Before cloning the repository, you should first ensure your</w:t>
+      </w:r>
+      <w:r>
+        <w:t xml:space="preserve"> </w:t>
+      </w:r>
+      <w:r>
+        <w:rPr>
+          <w:rStyle w:val="VerbatimChar"/>
+        </w:rPr>
+        <w:t xml:space="preserve">kubectl</w:t>
+      </w:r>
+      <w:r>
+        <w:t xml:space="preserve"> </w:t>
+      </w:r>
+      <w:r>
+        <w:t xml:space="preserve">is configured to access the target Kubernetes cluster and that you have the necessary permissions for the relevant namespaces. Once connectivity is verified, you should run the provided deployment scripts (such as</w:t>
+      </w:r>
+      <w:r>
+        <w:t xml:space="preserve"> </w:t>
+      </w:r>
+      <w:r>
+        <w:rPr>
+          <w:rStyle w:val="VerbatimChar"/>
+        </w:rPr>
+        <w:t xml:space="preserve">install-prereq.sh</w:t>
+      </w:r>
+      <w:r>
+        <w:t xml:space="preserve">,</w:t>
+      </w:r>
+      <w:r>
+        <w:t xml:space="preserve"> </w:t>
+      </w:r>
+      <w:r>
+        <w:rPr>
+          <w:rStyle w:val="VerbatimChar"/>
+        </w:rPr>
+        <w:t xml:space="preserve">initialise-prereq.sh</w:t>
+      </w:r>
+      <w:r>
+        <w:t xml:space="preserve">, and</w:t>
+      </w:r>
+      <w:r>
+        <w:t xml:space="preserve"> </w:t>
+      </w:r>
+      <w:r>
+        <w:rPr>
+          <w:rStyle w:val="VerbatimChar"/>
+        </w:rPr>
+        <w:t xml:space="preserve">install-esignet.sh</w:t>
+      </w:r>
+      <w:r>
+        <w:t xml:space="preserve">) from your local machine.</w:t>
+      </w:r>
+    </w:p>
+    <w:p>
+      <w:pPr>
+        <w:pStyle w:val="SourceCode"/>
+      </w:pPr>
+      <w:r>
+        <w:rPr>
+          <w:rStyle w:val="CommentTok"/>
+        </w:rPr>
+        <w:t xml:space="preserve"># Clone eSignet repository</w:t>
+      </w:r>
+      <w:r>
+        <w:br/>
+      </w:r>
+      <w:r>
+        <w:rPr>
+          <w:rStyle w:val="FunctionTok"/>
+        </w:rPr>
+        <w:t xml:space="preserve">git</w:t>
+      </w:r>
+      <w:r>
+        <w:rPr>
+          <w:rStyle w:val="NormalTok"/>
+        </w:rPr>
+        <w:t xml:space="preserve"> clone https://github.com/mosip/esignet.git</w:t>
+      </w:r>
+      <w:r>
+        <w:br/>
+      </w:r>
+      <w:r>
+        <w:rPr>
+          <w:rStyle w:val="BuiltInTok"/>
+        </w:rPr>
+        <w:t xml:space="preserve">cd</w:t>
+      </w:r>
+      <w:r>
+        <w:rPr>
+          <w:rStyle w:val="NormalTok"/>
+        </w:rPr>
+        <w:t xml:space="preserve"> esignet/deploy</w:t>
+      </w:r>
+    </w:p>
+    <w:bookmarkEnd w:id="28"/>
+    <w:bookmarkStart w:id="55" w:name="deploy-esignet-services"/>
     <w:p>
       <w:pPr>
         <w:pStyle w:val="Heading2"/>
       </w:pPr>
       <w:r>
-        <w:t xml:space="preserve">Verify existing</w:t>
-      </w:r>
-      <w:r>
-        <w:t xml:space="preserve"> </w:t>
-      </w:r>
-      <w:r>
-        <w:t xml:space="preserve">‘ID System’</w:t>
-      </w:r>
-      <w:r>
-        <w:t xml:space="preserve"> </w:t>
-      </w:r>
-      <w:r>
-        <w:t xml:space="preserve">next to which you will deploy eSignet</w:t>
+        <w:t xml:space="preserve">Deploy eSignet services</w:t>
       </w:r>
     </w:p>
     <w:p>
@@ -1379,7 +1755,70 @@
         <w:pStyle w:val="FirstParagraph"/>
       </w:pPr>
       <w:r>
-        <w:t xml:space="preserve">In case you are deploying eSignet with an ID System (like MOSIP), you should first validate that the existing ID System is healthy and operational, after which you can deploy.</w:t>
+        <w:t xml:space="preserve">Once steps mentioned above are complete and you have verified access, proceed with the deployment scripts as explained below.</w:t>
+      </w:r>
+    </w:p>
+    <w:bookmarkStart w:id="29" w:name="install-prerequisites"/>
+    <w:p>
+      <w:pPr>
+        <w:pStyle w:val="Heading3"/>
+      </w:pPr>
+      <w:r>
+        <w:t xml:space="preserve">Install Prerequisites</w:t>
+      </w:r>
+    </w:p>
+    <w:p>
+      <w:pPr>
+        <w:pStyle w:val="FirstParagraph"/>
+      </w:pPr>
+      <w:r>
+        <w:t xml:space="preserve">The prerequisites that you install ensures that the environment is ready for deploying eSignet core services and plugins.</w:t>
+      </w:r>
+    </w:p>
+    <w:p>
+      <w:pPr>
+        <w:pStyle w:val="BlockText"/>
+      </w:pPr>
+      <w:r>
+        <w:t xml:space="preserve">Note: What if I already have some of these dependencies (prerequisites) installed?</w:t>
+      </w:r>
+      <w:r>
+        <w:t xml:space="preserve"> </w:t>
+      </w:r>
+      <w:r>
+        <w:t xml:space="preserve">If you already have dependencies like Postgres or Keycloak installed as part of your existing ID System (e.g. MOSIP) setup, you can skip the particular component and the respective prompt and jump to the next prompt to proceed on with the running script.</w:t>
+      </w:r>
+    </w:p>
+    <w:p>
+      <w:pPr>
+        <w:pStyle w:val="FirstParagraph"/>
+      </w:pPr>
+      <w:r>
+        <w:t xml:space="preserve">When running the install scripts, you are prompted to make selections for various components and configurations. This section of the guide outlines the prompts you can expect, along with guidance on when to answer</w:t>
+      </w:r>
+      <w:r>
+        <w:t xml:space="preserve"> </w:t>
+      </w:r>
+      <w:r>
+        <w:t xml:space="preserve">‘y’</w:t>
+      </w:r>
+      <w:r>
+        <w:t xml:space="preserve"> </w:t>
+      </w:r>
+      <w:r>
+        <w:t xml:space="preserve">(yes) or</w:t>
+      </w:r>
+      <w:r>
+        <w:t xml:space="preserve"> </w:t>
+      </w:r>
+      <w:r>
+        <w:t xml:space="preserve">‘n’</w:t>
+      </w:r>
+      <w:r>
+        <w:t xml:space="preserve"> </w:t>
+      </w:r>
+      <w:r>
+        <w:t xml:space="preserve">(no) based on your environment.</w:t>
       </w:r>
     </w:p>
     <w:p>
@@ -1387,190 +1826,26 @@
         <w:pStyle w:val="BodyText"/>
       </w:pPr>
       <w:r>
-        <w:t xml:space="preserve">We have considered MOSIP for an example and scope of this document.</w:t>
-      </w:r>
-    </w:p>
-    <w:p>
-      <w:pPr>
-        <w:pStyle w:val="SourceCode"/>
-      </w:pPr>
-      <w:r>
-        <w:rPr>
-          <w:rStyle w:val="CommentTok"/>
-        </w:rPr>
-        <w:t xml:space="preserve"># Test cluster connectivity</w:t>
-      </w:r>
-      <w:r>
-        <w:br/>
-      </w:r>
-      <w:r>
-        <w:rPr>
-          <w:rStyle w:val="ExtensionTok"/>
-        </w:rPr>
-        <w:t xml:space="preserve">kubectl</w:t>
-      </w:r>
-      <w:r>
-        <w:rPr>
-          <w:rStyle w:val="NormalTok"/>
-        </w:rPr>
-        <w:t xml:space="preserve"> get nodes</w:t>
-      </w:r>
-      <w:r>
-        <w:br/>
-      </w:r>
-      <w:r>
-        <w:br/>
-      </w:r>
-      <w:r>
-        <w:rPr>
-          <w:rStyle w:val="CommentTok"/>
-        </w:rPr>
-        <w:t xml:space="preserve"># Check MOSIP deployment status</w:t>
-      </w:r>
-      <w:r>
-        <w:br/>
-      </w:r>
-      <w:r>
-        <w:rPr>
-          <w:rStyle w:val="ExtensionTok"/>
-        </w:rPr>
-        <w:t xml:space="preserve">kubectl</w:t>
-      </w:r>
-      <w:r>
-        <w:rPr>
-          <w:rStyle w:val="NormalTok"/>
-        </w:rPr>
-        <w:t xml:space="preserve"> get pods </w:t>
-      </w:r>
-      <w:r>
-        <w:rPr>
-          <w:rStyle w:val="AttributeTok"/>
-        </w:rPr>
-        <w:t xml:space="preserve">-n</w:t>
-      </w:r>
-      <w:r>
-        <w:rPr>
-          <w:rStyle w:val="NormalTok"/>
-        </w:rPr>
-        <w:t xml:space="preserve"> mosip</w:t>
-      </w:r>
-      <w:r>
-        <w:br/>
-      </w:r>
-      <w:r>
-        <w:rPr>
-          <w:rStyle w:val="ExtensionTok"/>
-        </w:rPr>
-        <w:t xml:space="preserve">kubectl</w:t>
-      </w:r>
-      <w:r>
-        <w:rPr>
-          <w:rStyle w:val="NormalTok"/>
-        </w:rPr>
-        <w:t xml:space="preserve"> get svc </w:t>
-      </w:r>
-      <w:r>
-        <w:rPr>
-          <w:rStyle w:val="AttributeTok"/>
-        </w:rPr>
-        <w:t xml:space="preserve">-n</w:t>
-      </w:r>
-      <w:r>
-        <w:rPr>
-          <w:rStyle w:val="NormalTok"/>
-        </w:rPr>
-        <w:t xml:space="preserve"> mosip</w:t>
-      </w:r>
-      <w:r>
-        <w:br/>
-      </w:r>
-      <w:r>
-        <w:br/>
-      </w:r>
-      <w:r>
-        <w:rPr>
-          <w:rStyle w:val="CommentTok"/>
-        </w:rPr>
-        <w:t xml:space="preserve"># Verify key MOSIP services are running</w:t>
-      </w:r>
-      <w:r>
-        <w:br/>
-      </w:r>
-      <w:r>
-        <w:rPr>
-          <w:rStyle w:val="ExtensionTok"/>
-        </w:rPr>
-        <w:t xml:space="preserve">kubectl</w:t>
-      </w:r>
-      <w:r>
-        <w:rPr>
-          <w:rStyle w:val="NormalTok"/>
-        </w:rPr>
-        <w:t xml:space="preserve"> get pods </w:t>
-      </w:r>
-      <w:r>
-        <w:rPr>
-          <w:rStyle w:val="AttributeTok"/>
-        </w:rPr>
-        <w:t xml:space="preserve">-n</w:t>
-      </w:r>
-      <w:r>
-        <w:rPr>
-          <w:rStyle w:val="NormalTok"/>
-        </w:rPr>
-        <w:t xml:space="preserve"> mosip </w:t>
-      </w:r>
-      <w:r>
-        <w:rPr>
-          <w:rStyle w:val="KeywordTok"/>
-        </w:rPr>
-        <w:t xml:space="preserve">|</w:t>
-      </w:r>
-      <w:r>
-        <w:rPr>
-          <w:rStyle w:val="NormalTok"/>
-        </w:rPr>
-        <w:t xml:space="preserve"> </w:t>
-      </w:r>
-      <w:r>
-        <w:rPr>
-          <w:rStyle w:val="FunctionTok"/>
-        </w:rPr>
-        <w:t xml:space="preserve">grep</w:t>
-      </w:r>
-      <w:r>
-        <w:rPr>
-          <w:rStyle w:val="NormalTok"/>
-        </w:rPr>
-        <w:t xml:space="preserve"> </w:t>
-      </w:r>
-      <w:r>
-        <w:rPr>
-          <w:rStyle w:val="AttributeTok"/>
-        </w:rPr>
-        <w:t xml:space="preserve">-E</w:t>
-      </w:r>
-      <w:r>
-        <w:rPr>
-          <w:rStyle w:val="NormalTok"/>
-        </w:rPr>
-        <w:t xml:space="preserve"> </w:t>
-      </w:r>
-      <w:r>
-        <w:rPr>
-          <w:rStyle w:val="StringTok"/>
-        </w:rPr>
-        <w:t xml:space="preserve">"(ida|pms|kernel|postgres|keycloak|redis)"</w:t>
-      </w:r>
-    </w:p>
-    <w:bookmarkEnd w:id="34"/>
-    <w:bookmarkStart w:id="35" w:name="clone-esignet-repository"/>
-    <w:p>
-      <w:pPr>
-        <w:pStyle w:val="Heading2"/>
-      </w:pPr>
-      <w:r>
-        <w:t xml:space="preserve">Clone eSignet Repository</w:t>
+        <w:t xml:space="preserve">Some prompts are chained — your response to one may trigger additional questions. Review the following section to familiarize yourself with the installation flow and prepare your answers in advance for a smoother deployment experience.</w:t>
+      </w:r>
+    </w:p>
+    <w:bookmarkEnd w:id="29"/>
+    <w:bookmarkStart w:id="30" w:name="X9d67d2413b41fc8f33993533695b418cf0f9847"/>
+    <w:p>
+      <w:pPr>
+        <w:pStyle w:val="Heading3"/>
+      </w:pPr>
+      <w:r>
+        <w:t xml:space="preserve">What all gets installed with</w:t>
+      </w:r>
+      <w:r>
+        <w:t xml:space="preserve"> </w:t>
+      </w:r>
+      <w:r>
+        <w:t xml:space="preserve">‘Prerequisites Installation’</w:t>
+      </w:r>
+      <w:r>
+        <w:t xml:space="preserve">?**</w:t>
       </w:r>
     </w:p>
     <w:p>
@@ -1578,225 +1853,6 @@
         <w:pStyle w:val="FirstParagraph"/>
       </w:pPr>
       <w:r>
-        <w:t xml:space="preserve">This allows you to access the deployment scripts and configuration files required for installing eSignet.</w:t>
-      </w:r>
-    </w:p>
-    <w:p>
-      <w:pPr>
-        <w:pStyle w:val="BlockText"/>
-      </w:pPr>
-      <w:r>
-        <w:t xml:space="preserve">Note: Before cloning the repository, you should first ensure your</w:t>
-      </w:r>
-      <w:r>
-        <w:t xml:space="preserve"> </w:t>
-      </w:r>
-      <w:r>
-        <w:rPr>
-          <w:rStyle w:val="VerbatimChar"/>
-        </w:rPr>
-        <w:t xml:space="preserve">kubectl</w:t>
-      </w:r>
-      <w:r>
-        <w:t xml:space="preserve"> </w:t>
-      </w:r>
-      <w:r>
-        <w:t xml:space="preserve">is configured to access the target Kubernetes cluster and that you have the necessary permissions for the relevant namespaces. Once connectivity is verified, you should run the provided deployment scripts (such as</w:t>
-      </w:r>
-      <w:r>
-        <w:t xml:space="preserve"> </w:t>
-      </w:r>
-      <w:r>
-        <w:rPr>
-          <w:rStyle w:val="VerbatimChar"/>
-        </w:rPr>
-        <w:t xml:space="preserve">install-prereq.sh</w:t>
-      </w:r>
-      <w:r>
-        <w:t xml:space="preserve">,</w:t>
-      </w:r>
-      <w:r>
-        <w:t xml:space="preserve"> </w:t>
-      </w:r>
-      <w:r>
-        <w:rPr>
-          <w:rStyle w:val="VerbatimChar"/>
-        </w:rPr>
-        <w:t xml:space="preserve">initialise-prereq.sh</w:t>
-      </w:r>
-      <w:r>
-        <w:t xml:space="preserve">, and</w:t>
-      </w:r>
-      <w:r>
-        <w:t xml:space="preserve"> </w:t>
-      </w:r>
-      <w:r>
-        <w:rPr>
-          <w:rStyle w:val="VerbatimChar"/>
-        </w:rPr>
-        <w:t xml:space="preserve">install-esignet.sh</w:t>
-      </w:r>
-      <w:r>
-        <w:t xml:space="preserve">) from your local machine.</w:t>
-      </w:r>
-    </w:p>
-    <w:p>
-      <w:pPr>
-        <w:pStyle w:val="SourceCode"/>
-      </w:pPr>
-      <w:r>
-        <w:br/>
-      </w:r>
-      <w:r>
-        <w:rPr>
-          <w:rStyle w:val="CommentTok"/>
-        </w:rPr>
-        <w:t xml:space="preserve"># Clone eSignet repository</w:t>
-      </w:r>
-      <w:r>
-        <w:br/>
-      </w:r>
-      <w:r>
-        <w:rPr>
-          <w:rStyle w:val="FunctionTok"/>
-        </w:rPr>
-        <w:t xml:space="preserve">git</w:t>
-      </w:r>
-      <w:r>
-        <w:rPr>
-          <w:rStyle w:val="NormalTok"/>
-        </w:rPr>
-        <w:t xml:space="preserve"> clone https://github.com/mosip/esignet.git</w:t>
-      </w:r>
-      <w:r>
-        <w:br/>
-      </w:r>
-      <w:r>
-        <w:rPr>
-          <w:rStyle w:val="BuiltInTok"/>
-        </w:rPr>
-        <w:t xml:space="preserve">cd</w:t>
-      </w:r>
-      <w:r>
-        <w:rPr>
-          <w:rStyle w:val="NormalTok"/>
-        </w:rPr>
-        <w:t xml:space="preserve"> esignet/deploy</w:t>
-      </w:r>
-    </w:p>
-    <w:bookmarkEnd w:id="35"/>
-    <w:bookmarkStart w:id="62" w:name="deploy-esignet-services"/>
-    <w:p>
-      <w:pPr>
-        <w:pStyle w:val="Heading2"/>
-      </w:pPr>
-      <w:r>
-        <w:t xml:space="preserve">Deploy eSignet services</w:t>
-      </w:r>
-    </w:p>
-    <w:p>
-      <w:pPr>
-        <w:pStyle w:val="FirstParagraph"/>
-      </w:pPr>
-      <w:r>
-        <w:t xml:space="preserve">Once steps mentioned above are complete and you have verified access, proceed with the deployment scripts as outlined below.</w:t>
-      </w:r>
-    </w:p>
-    <w:bookmarkStart w:id="36" w:name="install-prerequisites"/>
-    <w:p>
-      <w:pPr>
-        <w:pStyle w:val="Heading3"/>
-      </w:pPr>
-      <w:r>
-        <w:t xml:space="preserve">Install Prerequisites</w:t>
-      </w:r>
-    </w:p>
-    <w:p>
-      <w:pPr>
-        <w:pStyle w:val="FirstParagraph"/>
-      </w:pPr>
-      <w:r>
-        <w:t xml:space="preserve">The prerequisites that you install ensures that the environment is ready for deploying eSignet core services and plugins.</w:t>
-      </w:r>
-    </w:p>
-    <w:p>
-      <w:pPr>
-        <w:pStyle w:val="BlockText"/>
-      </w:pPr>
-      <w:r>
-        <w:t xml:space="preserve">Note: What if I already have some of these dependencies (prerequisites) installed?</w:t>
-      </w:r>
-      <w:r>
-        <w:t xml:space="preserve"> </w:t>
-      </w:r>
-      <w:r>
-        <w:t xml:space="preserve">If you already have dependencies like Postgres or Keycloak installed as part of your existing ID System (e.g. MOSIP) setup, you can skip their installation during the prerequisite step while the installation script is run and you are prompted.</w:t>
-      </w:r>
-    </w:p>
-    <w:p>
-      <w:pPr>
-        <w:pStyle w:val="FirstParagraph"/>
-      </w:pPr>
-      <w:r>
-        <w:t xml:space="preserve">When running the install scripts, you will be prompted to make selections for various components and configurations. This guide outlines the prompts you can expect, along with guidance on when to answer</w:t>
-      </w:r>
-      <w:r>
-        <w:t xml:space="preserve"> </w:t>
-      </w:r>
-      <w:r>
-        <w:t xml:space="preserve">‘y’</w:t>
-      </w:r>
-      <w:r>
-        <w:t xml:space="preserve"> </w:t>
-      </w:r>
-      <w:r>
-        <w:t xml:space="preserve">(yes) or</w:t>
-      </w:r>
-      <w:r>
-        <w:t xml:space="preserve"> </w:t>
-      </w:r>
-      <w:r>
-        <w:t xml:space="preserve">‘n’</w:t>
-      </w:r>
-      <w:r>
-        <w:t xml:space="preserve"> </w:t>
-      </w:r>
-      <w:r>
-        <w:t xml:space="preserve">(no) based on your environment.</w:t>
-      </w:r>
-    </w:p>
-    <w:p>
-      <w:pPr>
-        <w:pStyle w:val="BodyText"/>
-      </w:pPr>
-      <w:r>
-        <w:t xml:space="preserve">Some prompts are chained — your response to one may trigger additional questions. Review the following section to familiarize yourself with the installation flow and prepare your answers in advance for a smoother deployment experience.</w:t>
-      </w:r>
-    </w:p>
-    <w:bookmarkEnd w:id="36"/>
-    <w:bookmarkStart w:id="37" w:name="X9d67d2413b41fc8f33993533695b418cf0f9847"/>
-    <w:p>
-      <w:pPr>
-        <w:pStyle w:val="Heading3"/>
-      </w:pPr>
-      <w:r>
-        <w:t xml:space="preserve">What all gets installed with</w:t>
-      </w:r>
-      <w:r>
-        <w:t xml:space="preserve"> </w:t>
-      </w:r>
-      <w:r>
-        <w:t xml:space="preserve">‘Prerequisites Installation’</w:t>
-      </w:r>
-      <w:r>
-        <w:t xml:space="preserve">?**</w:t>
-      </w:r>
-    </w:p>
-    <w:p>
-      <w:pPr>
-        <w:pStyle w:val="FirstParagraph"/>
-      </w:pPr>
-      <w:r>
         <w:t xml:space="preserve">This sets up dependencies like Postgres, Keycloak, Redis, and other required services.</w:t>
       </w:r>
       <w:r>
@@ -1810,7 +1866,7 @@
       <w:pPr>
         <w:numPr>
           <w:ilvl w:val="0"/>
-          <w:numId w:val="1014"/>
+          <w:numId w:val="1011"/>
         </w:numPr>
       </w:pPr>
       <w:r>
@@ -1828,7 +1884,7 @@
       <w:pPr>
         <w:numPr>
           <w:ilvl w:val="0"/>
-          <w:numId w:val="1014"/>
+          <w:numId w:val="1011"/>
         </w:numPr>
       </w:pPr>
       <w:r>
@@ -1846,7 +1902,7 @@
       <w:pPr>
         <w:numPr>
           <w:ilvl w:val="0"/>
-          <w:numId w:val="1014"/>
+          <w:numId w:val="1011"/>
         </w:numPr>
       </w:pPr>
       <w:r>
@@ -1864,7 +1920,7 @@
       <w:pPr>
         <w:numPr>
           <w:ilvl w:val="0"/>
-          <w:numId w:val="1014"/>
+          <w:numId w:val="1011"/>
         </w:numPr>
       </w:pPr>
       <w:r>
@@ -1882,7 +1938,7 @@
       <w:pPr>
         <w:numPr>
           <w:ilvl w:val="0"/>
-          <w:numId w:val="1014"/>
+          <w:numId w:val="1011"/>
         </w:numPr>
       </w:pPr>
       <w:r>
@@ -1900,7 +1956,7 @@
       <w:pPr>
         <w:numPr>
           <w:ilvl w:val="0"/>
-          <w:numId w:val="1014"/>
+          <w:numId w:val="1011"/>
         </w:numPr>
       </w:pPr>
       <w:r>
@@ -1945,7 +2001,7 @@
       <w:pPr>
         <w:numPr>
           <w:ilvl w:val="0"/>
-          <w:numId w:val="1014"/>
+          <w:numId w:val="1011"/>
         </w:numPr>
       </w:pPr>
       <w:r>
@@ -1980,8 +2036,8 @@
         <w:t xml:space="preserve">).</w:t>
       </w:r>
     </w:p>
-    <w:bookmarkEnd w:id="37"/>
-    <w:bookmarkStart w:id="39" w:name="Xc1dddd95db26b3b36847b52c65f9d6e32cc2a4a"/>
+    <w:bookmarkEnd w:id="30"/>
+    <w:bookmarkStart w:id="32" w:name="Xc1dddd95db26b3b36847b52c65f9d6e32cc2a4a"/>
     <w:p>
       <w:pPr>
         <w:pStyle w:val="Heading3"/>
@@ -2033,7 +2089,7 @@
         <w:pStyle w:val="Compact"/>
         <w:numPr>
           <w:ilvl w:val="0"/>
-          <w:numId w:val="1015"/>
+          <w:numId w:val="1012"/>
         </w:numPr>
       </w:pPr>
       <w:r>
@@ -2066,7 +2122,7 @@
         <w:pStyle w:val="Compact"/>
         <w:numPr>
           <w:ilvl w:val="0"/>
-          <w:numId w:val="1016"/>
+          <w:numId w:val="1013"/>
         </w:numPr>
       </w:pPr>
       <w:r>
@@ -2104,7 +2160,7 @@
         <w:pStyle w:val="Compact"/>
         <w:numPr>
           <w:ilvl w:val="0"/>
-          <w:numId w:val="1017"/>
+          <w:numId w:val="1014"/>
         </w:numPr>
       </w:pPr>
       <w:r>
@@ -2116,7 +2172,7 @@
         <w:pStyle w:val="Compact"/>
         <w:numPr>
           <w:ilvl w:val="0"/>
-          <w:numId w:val="1017"/>
+          <w:numId w:val="1014"/>
         </w:numPr>
       </w:pPr>
       <w:r>
@@ -2125,7 +2181,7 @@
       <w:r>
         <w:t xml:space="preserve"> </w:t>
       </w:r>
-      <w:hyperlink r:id="rId38">
+      <w:hyperlink r:id="rId31">
         <w:r>
           <w:rPr>
             <w:rStyle w:val="Hyperlink"/>
@@ -2145,7 +2201,7 @@
         <w:pStyle w:val="Compact"/>
         <w:numPr>
           <w:ilvl w:val="0"/>
-          <w:numId w:val="1017"/>
+          <w:numId w:val="1014"/>
         </w:numPr>
       </w:pPr>
       <w:r>
@@ -2199,7 +2255,7 @@
         <w:pStyle w:val="Compact"/>
         <w:numPr>
           <w:ilvl w:val="0"/>
-          <w:numId w:val="1018"/>
+          <w:numId w:val="1015"/>
         </w:numPr>
       </w:pPr>
       <w:r>
@@ -2226,7 +2282,7 @@
         <w:pStyle w:val="Compact"/>
         <w:numPr>
           <w:ilvl w:val="0"/>
-          <w:numId w:val="1018"/>
+          <w:numId w:val="1015"/>
         </w:numPr>
       </w:pPr>
       <w:r>
@@ -2241,8 +2297,8 @@
         <w:t xml:space="preserve">Once the configmap is updated, proceed with the prerequisite installation.</w:t>
       </w:r>
     </w:p>
-    <w:bookmarkEnd w:id="39"/>
-    <w:bookmarkStart w:id="47" w:name="run-the-.install-prereq.sh-script"/>
+    <w:bookmarkEnd w:id="32"/>
+    <w:bookmarkStart w:id="40" w:name="run-the-.install-prereq.sh-script"/>
     <w:p>
       <w:pPr>
         <w:pStyle w:val="Heading3"/>
@@ -2300,7 +2356,7 @@
         <w:t xml:space="preserve">./install-prereq.sh</w:t>
       </w:r>
     </w:p>
-    <w:bookmarkStart w:id="45" w:name="hsm"/>
+    <w:bookmarkStart w:id="38" w:name="hsm"/>
     <w:p>
       <w:pPr>
         <w:pStyle w:val="Heading4"/>
@@ -2314,16 +2370,7 @@
         <w:pStyle w:val="FirstParagraph"/>
       </w:pPr>
       <w:r>
-        <w:t xml:space="preserve">[</w:t>
-      </w:r>
-      <w:r>
-        <w:t xml:space="preserve">“hsm”</w:t>
-      </w:r>
-      <w:r>
-        <w:t xml:space="preserve">]=</w:t>
-      </w:r>
-      <w:r>
-        <w:t xml:space="preserve">“Do you want to deploy hsm for esignet service? Please opt for</w:t>
+        <w:t xml:space="preserve">Do you want to deploy hsm for esignet service? Please opt for</w:t>
       </w:r>
       <w:r>
         <w:t xml:space="preserve"> </w:t>
@@ -2430,7 +2477,7 @@
         <w:t xml:space="preserve">  3.  ["externalhsmpassword"] = "Please provide the password for the externalhsm: "</w:t>
       </w:r>
     </w:p>
-    <w:bookmarkStart w:id="40" w:name="apiaccesscontrol"/>
+    <w:bookmarkStart w:id="33" w:name="apiaccesscontrol"/>
     <w:p>
       <w:pPr>
         <w:pStyle w:val="Heading5"/>
@@ -2444,19 +2491,7 @@
         <w:pStyle w:val="FirstParagraph"/>
       </w:pPr>
       <w:r>
-        <w:t xml:space="preserve">[</w:t>
-      </w:r>
-      <w:r>
-        <w:t xml:space="preserve">“apiaccesscontrol”</w:t>
-      </w:r>
-      <w:r>
-        <w:t xml:space="preserve">] =</w:t>
-      </w:r>
-      <w:r>
-        <w:t xml:space="preserve"> </w:t>
-      </w:r>
-      <w:r>
-        <w:t xml:space="preserve">“Do you want to access control the esignet client management APIs? Please opt for</w:t>
+        <w:t xml:space="preserve">Do you want to access control the esignet client management APIs? Please opt for</w:t>
       </w:r>
       <w:r>
         <w:t xml:space="preserve"> </w:t>
@@ -2551,8 +2586,8 @@
         <w:t xml:space="preserve">3.  ["adminpassword"] = "Please provide admin password for initialisation"</w:t>
       </w:r>
     </w:p>
-    <w:bookmarkEnd w:id="40"/>
-    <w:bookmarkStart w:id="41" w:name="kafka"/>
+    <w:bookmarkEnd w:id="33"/>
+    <w:bookmarkStart w:id="34" w:name="kafka"/>
     <w:p>
       <w:pPr>
         <w:pStyle w:val="Heading5"/>
@@ -2566,16 +2601,7 @@
         <w:pStyle w:val="FirstParagraph"/>
       </w:pPr>
       <w:r>
-        <w:t xml:space="preserve">[</w:t>
-      </w:r>
-      <w:r>
-        <w:t xml:space="preserve">“kafka”</w:t>
-      </w:r>
-      <w:r>
-        <w:t xml:space="preserve">]=</w:t>
-      </w:r>
-      <w:r>
-        <w:t xml:space="preserve">“Do you want to deploy Kafka in the kafka namespace? Please opt for</w:t>
+        <w:t xml:space="preserve">Do you want to deploy Kafka in the kafka namespace? Please opt for</w:t>
       </w:r>
       <w:r>
         <w:t xml:space="preserve"> </w:t>
@@ -2610,7 +2636,7 @@
         <w:pStyle w:val="Compact"/>
         <w:numPr>
           <w:ilvl w:val="0"/>
-          <w:numId w:val="1019"/>
+          <w:numId w:val="1016"/>
         </w:numPr>
       </w:pPr>
       <w:r>
@@ -2640,15 +2666,15 @@
         <w:pStyle w:val="Compact"/>
         <w:numPr>
           <w:ilvl w:val="0"/>
-          <w:numId w:val="1019"/>
+          <w:numId w:val="1016"/>
         </w:numPr>
       </w:pPr>
       <w:r>
         <w:t xml:space="preserve">y - If you want to install kafka</w:t>
       </w:r>
     </w:p>
-    <w:bookmarkEnd w:id="41"/>
-    <w:bookmarkStart w:id="42" w:name="postgres"/>
+    <w:bookmarkEnd w:id="34"/>
+    <w:bookmarkStart w:id="35" w:name="postgres"/>
     <w:p>
       <w:pPr>
         <w:pStyle w:val="Heading5"/>
@@ -2662,16 +2688,7 @@
         <w:pStyle w:val="FirstParagraph"/>
       </w:pPr>
       <w:r>
-        <w:t xml:space="preserve">[</w:t>
-      </w:r>
-      <w:r>
-        <w:t xml:space="preserve">“postgres”</w:t>
-      </w:r>
-      <w:r>
-        <w:t xml:space="preserve">]=</w:t>
-      </w:r>
-      <w:r>
-        <w:t xml:space="preserve">“Do you want to deploy postgres in the postgres namespace? Please opt for</w:t>
+        <w:t xml:space="preserve">Do you want to deploy postgres in the postgres namespace? Please opt for</w:t>
       </w:r>
       <w:r>
         <w:t xml:space="preserve"> </w:t>
@@ -2705,7 +2722,7 @@
       <w:pPr>
         <w:numPr>
           <w:ilvl w:val="0"/>
-          <w:numId w:val="1020"/>
+          <w:numId w:val="1017"/>
         </w:numPr>
       </w:pPr>
       <w:r>
@@ -2716,7 +2733,7 @@
       <w:pPr>
         <w:numPr>
           <w:ilvl w:val="0"/>
-          <w:numId w:val="1020"/>
+          <w:numId w:val="1017"/>
         </w:numPr>
       </w:pPr>
       <w:r>
@@ -2730,13 +2747,158 @@
           <w:b/>
           <w:bCs/>
         </w:rPr>
-        <w:t xml:space="preserve">The below set of questions [b-e] should be prompted only when the answer to the above is</w:t>
-      </w:r>
+        <w:t xml:space="preserve">The set of questions below (b-e) are prompted</w:t>
+      </w:r>
+    </w:p>
+    <w:p>
+      <w:pPr>
+        <w:numPr>
+          <w:ilvl w:val="0"/>
+          <w:numId w:val="1017"/>
+        </w:numPr>
+      </w:pPr>
+      <w:r>
+        <w:t xml:space="preserve">[</w:t>
+      </w:r>
+      <w:r>
+        <w:t xml:space="preserve">“postgreshostname”</w:t>
+      </w:r>
+      <w:r>
+        <w:t xml:space="preserve">] =</w:t>
+      </w:r>
+      <w:r>
+        <w:t xml:space="preserve"> </w:t>
+      </w:r>
+      <w:r>
+        <w:t xml:space="preserve">“Please provide the hostname for the postgres server:”</w:t>
+      </w:r>
+    </w:p>
+    <w:p>
+      <w:pPr>
+        <w:numPr>
+          <w:ilvl w:val="0"/>
+          <w:numId w:val="1017"/>
+        </w:numPr>
+      </w:pPr>
+      <w:r>
+        <w:t xml:space="preserve">[</w:t>
+      </w:r>
+      <w:r>
+        <w:t xml:space="preserve">“postgresport”</w:t>
+      </w:r>
+      <w:r>
+        <w:t xml:space="preserve">] =</w:t>
+      </w:r>
+      <w:r>
+        <w:t xml:space="preserve"> </w:t>
+      </w:r>
+      <w:r>
+        <w:t xml:space="preserve">“Please provide the port number for the postgres server:”</w:t>
+      </w:r>
+    </w:p>
+    <w:p>
+      <w:pPr>
+        <w:numPr>
+          <w:ilvl w:val="0"/>
+          <w:numId w:val="1017"/>
+        </w:numPr>
+      </w:pPr>
+      <w:r>
+        <w:t xml:space="preserve">[</w:t>
+      </w:r>
+      <w:r>
+        <w:t xml:space="preserve">“postgresusername”</w:t>
+      </w:r>
+      <w:r>
+        <w:t xml:space="preserve">] =</w:t>
+      </w:r>
+      <w:r>
+        <w:t xml:space="preserve"> </w:t>
+      </w:r>
+      <w:r>
+        <w:t xml:space="preserve">“Please provide the username for the postgres server:”</w:t>
+      </w:r>
+    </w:p>
+    <w:p>
+      <w:pPr>
+        <w:numPr>
+          <w:ilvl w:val="0"/>
+          <w:numId w:val="1017"/>
+        </w:numPr>
+      </w:pPr>
+      <w:r>
+        <w:t xml:space="preserve">[</w:t>
+      </w:r>
+      <w:r>
+        <w:t xml:space="preserve">“postgrespassword”</w:t>
+      </w:r>
+      <w:r>
+        <w:t xml:space="preserve">] =</w:t>
+      </w:r>
+      <w:r>
+        <w:t xml:space="preserve"> </w:t>
+      </w:r>
+      <w:r>
+        <w:t xml:space="preserve">“Please provide the password for the postgres server:”</w:t>
+      </w:r>
+    </w:p>
+    <w:bookmarkEnd w:id="35"/>
+    <w:bookmarkStart w:id="36" w:name="redis"/>
+    <w:p>
+      <w:pPr>
+        <w:pStyle w:val="Heading5"/>
+      </w:pPr>
+      <w:r>
+        <w:t xml:space="preserve">Redis</w:t>
+      </w:r>
+    </w:p>
+    <w:p>
+      <w:pPr>
+        <w:pStyle w:val="FirstParagraph"/>
+      </w:pPr>
+      <w:r>
+        <w:t xml:space="preserve">Do you want to deploy redis in the redis namespace? Press enter for default y”</w:t>
+      </w:r>
+    </w:p>
+    <w:p>
+      <w:pPr>
+        <w:pStyle w:val="BodyText"/>
+      </w:pPr>
       <w:r>
         <w:rPr>
           <w:b/>
           <w:bCs/>
         </w:rPr>
+        <w:t xml:space="preserve">Prompts</w:t>
+      </w:r>
+      <w:r>
+        <w:t xml:space="preserve">:</w:t>
+      </w:r>
+    </w:p>
+    <w:p>
+      <w:pPr>
+        <w:pStyle w:val="Compact"/>
+        <w:numPr>
+          <w:ilvl w:val="0"/>
+          <w:numId w:val="1018"/>
+        </w:numPr>
+      </w:pPr>
+      <w:r>
+        <w:t xml:space="preserve">y - If you want to install redis</w:t>
+      </w:r>
+    </w:p>
+    <w:p>
+      <w:pPr>
+        <w:pStyle w:val="Compact"/>
+        <w:numPr>
+          <w:ilvl w:val="0"/>
+          <w:numId w:val="1018"/>
+        </w:numPr>
+      </w:pPr>
+      <w:r>
+        <w:t xml:space="preserve">n - If you already have a redis server deployed</w:t>
+      </w:r>
+      <w:r>
         <w:t xml:space="preserve"> </w:t>
       </w:r>
       <w:r>
@@ -2744,137 +2906,96 @@
           <w:b/>
           <w:bCs/>
         </w:rPr>
-        <w:t xml:space="preserve">‘n’</w:t>
-      </w:r>
+        <w:t xml:space="preserve">The set of questions below (b-d) are prompted</w:t>
+      </w:r>
+    </w:p>
+    <w:p>
+      <w:pPr>
+        <w:pStyle w:val="SourceCode"/>
+      </w:pPr>
+      <w:r>
+        <w:rPr>
+          <w:rStyle w:val="VerbatimChar"/>
+        </w:rPr>
+        <w:t xml:space="preserve">1.  ["redishostname"] = "Please provide the hostname for the redis server:"</w:t>
+      </w:r>
+      <w:r>
+        <w:br/>
+      </w:r>
+      <w:r>
+        <w:br/>
+      </w:r>
+      <w:r>
+        <w:rPr>
+          <w:rStyle w:val="VerbatimChar"/>
+        </w:rPr>
+        <w:t xml:space="preserve">2.  ["redisport"] = "Please provide the port number for the redis server:"</w:t>
+      </w:r>
+      <w:r>
+        <w:br/>
+      </w:r>
+      <w:r>
+        <w:br/>
+      </w:r>
+      <w:r>
+        <w:rPr>
+          <w:rStyle w:val="VerbatimChar"/>
+        </w:rPr>
+        <w:t xml:space="preserve">3.  ["redispassword"] = "Please provide the password for the redis server: "</w:t>
+      </w:r>
+    </w:p>
+    <w:p>
+      <w:pPr>
+        <w:pStyle w:val="FirstParagraph"/>
+      </w:pPr>
+      <w:r>
+        <w:t xml:space="preserve">The installation begin as per user requirement based on the above set of questions/prompts. Once the installation is completed, you are asked to enter the details to complete the setup for captcha validation service.</w:t>
+      </w:r>
+    </w:p>
+    <w:bookmarkEnd w:id="36"/>
+    <w:bookmarkStart w:id="37" w:name="captcha-validation-service"/>
+    <w:p>
+      <w:pPr>
+        <w:pStyle w:val="Heading5"/>
+      </w:pPr>
+      <w:r>
+        <w:t xml:space="preserve">Captcha Validation Service</w:t>
+      </w:r>
+    </w:p>
+    <w:p>
+      <w:pPr>
+        <w:pStyle w:val="FirstParagraph"/>
+      </w:pPr>
+      <w:r>
+        <w:t xml:space="preserve">Do you want to install captcha validation service? Press enter for default y</w:t>
+      </w:r>
+    </w:p>
+    <w:p>
+      <w:pPr>
+        <w:pStyle w:val="Compact"/>
+        <w:numPr>
+          <w:ilvl w:val="0"/>
+          <w:numId w:val="1019"/>
+        </w:numPr>
+      </w:pPr>
       <w:r>
         <w:rPr>
           <w:b/>
           <w:bCs/>
         </w:rPr>
-        <w:t xml:space="preserve">.</w:t>
-      </w:r>
-    </w:p>
-    <w:p>
-      <w:pPr>
-        <w:numPr>
-          <w:ilvl w:val="0"/>
-          <w:numId w:val="1020"/>
-        </w:numPr>
-      </w:pPr>
-      <w:r>
-        <w:t xml:space="preserve">[</w:t>
-      </w:r>
-      <w:r>
-        <w:t xml:space="preserve">“postgreshostname”</w:t>
-      </w:r>
-      <w:r>
-        <w:t xml:space="preserve">] =</w:t>
-      </w:r>
-      <w:r>
-        <w:t xml:space="preserve"> </w:t>
-      </w:r>
-      <w:r>
-        <w:t xml:space="preserve">“Please provide the hostname for the postgres server:”</w:t>
-      </w:r>
-    </w:p>
-    <w:p>
-      <w:pPr>
-        <w:numPr>
-          <w:ilvl w:val="0"/>
-          <w:numId w:val="1020"/>
-        </w:numPr>
-      </w:pPr>
-      <w:r>
-        <w:t xml:space="preserve">[</w:t>
-      </w:r>
-      <w:r>
-        <w:t xml:space="preserve">“postgresport”</w:t>
-      </w:r>
-      <w:r>
-        <w:t xml:space="preserve">] =</w:t>
-      </w:r>
-      <w:r>
-        <w:t xml:space="preserve"> </w:t>
-      </w:r>
-      <w:r>
-        <w:t xml:space="preserve">“Please provide the port number for the postgres server:”</w:t>
-      </w:r>
-    </w:p>
-    <w:p>
-      <w:pPr>
-        <w:numPr>
-          <w:ilvl w:val="0"/>
-          <w:numId w:val="1020"/>
-        </w:numPr>
-      </w:pPr>
-      <w:r>
-        <w:t xml:space="preserve">[</w:t>
-      </w:r>
-      <w:r>
-        <w:t xml:space="preserve">“postgresusername”</w:t>
-      </w:r>
-      <w:r>
-        <w:t xml:space="preserve">] =</w:t>
-      </w:r>
-      <w:r>
-        <w:t xml:space="preserve"> </w:t>
-      </w:r>
-      <w:r>
-        <w:t xml:space="preserve">“Please provide the username for the postgres server:”</w:t>
-      </w:r>
-    </w:p>
-    <w:p>
-      <w:pPr>
-        <w:numPr>
-          <w:ilvl w:val="0"/>
-          <w:numId w:val="1020"/>
-        </w:numPr>
-      </w:pPr>
-      <w:r>
-        <w:t xml:space="preserve">[</w:t>
-      </w:r>
-      <w:r>
-        <w:t xml:space="preserve">“postgrespassword”</w:t>
-      </w:r>
-      <w:r>
-        <w:t xml:space="preserve">] =</w:t>
-      </w:r>
-      <w:r>
-        <w:t xml:space="preserve"> </w:t>
-      </w:r>
-      <w:r>
-        <w:t xml:space="preserve">“Please provide the password for the postgres server:”</w:t>
-      </w:r>
-    </w:p>
-    <w:bookmarkEnd w:id="42"/>
-    <w:bookmarkStart w:id="43" w:name="redis"/>
-    <w:p>
-      <w:pPr>
-        <w:pStyle w:val="Heading5"/>
-      </w:pPr>
-      <w:r>
-        <w:t xml:space="preserve">Redis</w:t>
+        <w:t xml:space="preserve">Warning message:</w:t>
+      </w:r>
+      <w:r>
+        <w:t xml:space="preserve"> </w:t>
+      </w:r>
+      <w:r>
+        <w:t xml:space="preserve">“It is not recommended to use the eSignet without captcha site key and captcha secret key in production env. Press enter to proceed.</w:t>
       </w:r>
     </w:p>
     <w:p>
       <w:pPr>
         <w:pStyle w:val="FirstParagraph"/>
       </w:pPr>
-      <w:r>
-        <w:t xml:space="preserve">[</w:t>
-      </w:r>
-      <w:r>
-        <w:t xml:space="preserve">“redis”</w:t>
-      </w:r>
-      <w:r>
-        <w:t xml:space="preserve">]=</w:t>
-      </w:r>
-      <w:r>
-        <w:t xml:space="preserve">“Do you want to deploy redis in the redis namespace? Press enter for default y”</w:t>
-      </w:r>
-      <w:r>
-        <w:t xml:space="preserve"> </w:t>
-      </w:r>
       <w:r>
         <w:rPr>
           <w:b/>
@@ -2885,29 +3006,11 @@
       <w:r>
         <w:t xml:space="preserve">:</w:t>
       </w:r>
-    </w:p>
-    <w:p>
-      <w:pPr>
-        <w:pStyle w:val="Compact"/>
-        <w:numPr>
-          <w:ilvl w:val="0"/>
-          <w:numId w:val="1021"/>
-        </w:numPr>
-      </w:pPr>
-      <w:r>
-        <w:t xml:space="preserve">y - If you want to install redis</w:t>
-      </w:r>
-    </w:p>
-    <w:p>
-      <w:pPr>
-        <w:pStyle w:val="Compact"/>
-        <w:numPr>
-          <w:ilvl w:val="0"/>
-          <w:numId w:val="1021"/>
-        </w:numPr>
-      </w:pPr>
-      <w:r>
-        <w:t xml:space="preserve">n - If you already have a redis server deployed</w:t>
+      <w:r>
+        <w:t xml:space="preserve"> </w:t>
+      </w:r>
+      <w:r>
+        <w:t xml:space="preserve">1. y - If you want to install captcha validation service,</w:t>
       </w:r>
       <w:r>
         <w:t xml:space="preserve"> </w:t>
@@ -2917,7 +3020,7 @@
           <w:b/>
           <w:bCs/>
         </w:rPr>
-        <w:t xml:space="preserve">The below set of questions [b-d] should be prompted only when the answer to the above is</w:t>
+        <w:t xml:space="preserve">The below set of questions [c-d] is prompted only when the answer to the above is</w:t>
       </w:r>
       <w:r>
         <w:rPr>
@@ -2931,7 +3034,7 @@
           <w:b/>
           <w:bCs/>
         </w:rPr>
-        <w:t xml:space="preserve">‘n’</w:t>
+        <w:t xml:space="preserve">‘y’</w:t>
       </w:r>
       <w:r>
         <w:rPr>
@@ -2949,7 +3052,7 @@
         <w:rPr>
           <w:rStyle w:val="VerbatimChar"/>
         </w:rPr>
-        <w:t xml:space="preserve">1.  ["redishostname"] = "Please provide the hostname for the redis server: "</w:t>
+        <w:t xml:space="preserve">1.  ["captchasitekey"] = "Please provide the captcha site key"</w:t>
       </w:r>
       <w:r>
         <w:br/>
@@ -2961,7 +3064,7 @@
         <w:rPr>
           <w:rStyle w:val="VerbatimChar"/>
         </w:rPr>
-        <w:t xml:space="preserve">2.  ["redisport"] = "Please provide the port number for the redis server: "</w:t>
+        <w:t xml:space="preserve">2.  ["captchasecretkey"] = "Please provide the captcha secret key"</w:t>
       </w:r>
       <w:r>
         <w:br/>
@@ -2973,7 +3076,7 @@
         <w:rPr>
           <w:rStyle w:val="VerbatimChar"/>
         </w:rPr>
-        <w:t xml:space="preserve">3.  ["redispassword"] = "Please provide the password for the redis server: "</w:t>
+        <w:t xml:space="preserve">3.  If opted 'n' what needs to be done &lt;!-- explain --&gt;</w:t>
       </w:r>
     </w:p>
     <w:p>
@@ -2981,17 +3084,18 @@
         <w:pStyle w:val="FirstParagraph"/>
       </w:pPr>
       <w:r>
-        <w:t xml:space="preserve">The installations should begin as per user requirement based on the above set of questions/prompts. Once the installation is completed, user should be asked to enter the below details to complete the setup for captcha validation service.</w:t>
-      </w:r>
-    </w:p>
-    <w:bookmarkEnd w:id="43"/>
-    <w:bookmarkStart w:id="44" w:name="captcha-validation-service"/>
-    <w:p>
-      <w:pPr>
-        <w:pStyle w:val="Heading5"/>
-      </w:pPr>
-      <w:r>
-        <w:t xml:space="preserve">Captcha Validation Service</w:t>
+        <w:t xml:space="preserve">Prerequisite installation is complete at this stage.</w:t>
+      </w:r>
+    </w:p>
+    <w:bookmarkEnd w:id="37"/>
+    <w:bookmarkEnd w:id="38"/>
+    <w:bookmarkStart w:id="39" w:name="initialise-prerequisites"/>
+    <w:p>
+      <w:pPr>
+        <w:pStyle w:val="Heading4"/>
+      </w:pPr>
+      <w:r>
+        <w:t xml:space="preserve">Initialise Prerequisites</w:t>
       </w:r>
     </w:p>
     <w:p>
@@ -2999,10 +3103,76 @@
         <w:pStyle w:val="FirstParagraph"/>
       </w:pPr>
       <w:r>
+        <w:t xml:space="preserve">Run the</w:t>
+      </w:r>
+      <w:r>
+        <w:t xml:space="preserve"> </w:t>
+      </w:r>
+      <w:r>
+        <w:rPr>
+          <w:rStyle w:val="VerbatimChar"/>
+        </w:rPr>
+        <w:t xml:space="preserve">./initialise-prereq.sh</w:t>
+      </w:r>
+      <w:r>
+        <w:t xml:space="preserve"> </w:t>
+      </w:r>
+      <w:r>
+        <w:t xml:space="preserve">script (from deploy folder) to initialize required services such as the eSignet database and Keycloak. You will be prompted for configuration details based on your environment (e.g., database credentials, IAM scope, service endpoints).</w:t>
+      </w:r>
+      <w:r>
+        <w:t xml:space="preserve"> </w:t>
+      </w:r>
+      <w:r>
+        <w:t xml:space="preserve">Update the relevant values files before executing the script to ensure correct initialization.</w:t>
+      </w:r>
+      <w:r>
+        <w:t xml:space="preserve"> </w:t>
+      </w:r>
+    </w:p>
+    <w:p>
+      <w:pPr>
+        <w:pStyle w:val="SourceCode"/>
+      </w:pPr>
+      <w:r>
+        <w:br/>
+      </w:r>
+      <w:r>
+        <w:rPr>
+          <w:rStyle w:val="ExtensionTok"/>
+        </w:rPr>
+        <w:t xml:space="preserve">./initialise-prereq.sh</w:t>
+      </w:r>
+    </w:p>
+    <w:p>
+      <w:pPr>
+        <w:pStyle w:val="FirstParagraph"/>
+      </w:pPr>
+      <w:r>
+        <w:t xml:space="preserve">You are prompted to answer following questions based on whether the eSignet database is present or not in the postgres server url provided above.</w:t>
+      </w:r>
+      <w:r>
+        <w:t xml:space="preserve"> </w:t>
+      </w:r>
+      <w:r>
+        <w:t xml:space="preserve">Therefore, before you run the initialise script, update the Postgres and Keycloak values files as needed and then initialise.</w:t>
+      </w:r>
+      <w:r>
+        <w:t xml:space="preserve"> </w:t>
+      </w:r>
+    </w:p>
+    <w:p>
+      <w:pPr>
+        <w:numPr>
+          <w:ilvl w:val="0"/>
+          <w:numId w:val="1020"/>
+        </w:numPr>
+      </w:pPr>
+      <w:r>
         <w:t xml:space="preserve">[</w:t>
       </w:r>
       <w:r>
-        <w:t xml:space="preserve">“captchavalidationservice”</w:t>
+        <w:t xml:space="preserve">“postgres”</w:t>
       </w:r>
       <w:r>
         <w:t xml:space="preserve">] =</w:t>
@@ -3011,340 +3181,152 @@
         <w:t xml:space="preserve"> </w:t>
       </w:r>
       <w:r>
-        <w:t xml:space="preserve">“Do you want to install captcha validation service? Press enter for default y”</w:t>
-      </w:r>
-      <w:r>
-        <w:t xml:space="preserve"> </w:t>
-      </w:r>
+        <w:t xml:space="preserve">“eSignet database was not found. Running the db scripts to create and initialize the eSignet database:”</w:t>
+      </w:r>
+    </w:p>
+    <w:p>
+      <w:pPr>
+        <w:numPr>
+          <w:ilvl w:val="0"/>
+          <w:numId w:val="1020"/>
+        </w:numPr>
+      </w:pPr>
+      <w:r>
+        <w:t xml:space="preserve">Information to be added in the guide for the IAM scope in the deployment guide.</w:t>
+      </w:r>
+      <w:r>
+        <w:t xml:space="preserve"> </w:t>
+      </w:r>
+    </w:p>
+    <w:p>
+      <w:pPr>
+        <w:numPr>
+          <w:ilvl w:val="0"/>
+          <w:numId w:val="1020"/>
+        </w:numPr>
+      </w:pPr>
+      <w:r>
+        <w:t xml:space="preserve">In the deployment script, certificate endpoint, binding endpoint and client management endpoint are to be configured as internal.</w:t>
+      </w:r>
+    </w:p>
+    <w:bookmarkEnd w:id="39"/>
+    <w:bookmarkEnd w:id="40"/>
+    <w:bookmarkStart w:id="54" w:name="esignet-services-installation"/>
+    <w:p>
+      <w:pPr>
+        <w:pStyle w:val="Heading3"/>
+      </w:pPr>
+      <w:r>
+        <w:t xml:space="preserve">eSignet Services Installation</w:t>
+      </w:r>
+    </w:p>
+    <w:p>
+      <w:pPr>
+        <w:pStyle w:val="FirstParagraph"/>
+      </w:pPr>
+      <w:r>
+        <w:t xml:space="preserve">Once you have completed the pre-requisite installation and initialization, you can proceed to install the eSignet services.</w:t>
+      </w:r>
+    </w:p>
+    <w:bookmarkStart w:id="50" w:name="X8b79eb935824ace5c5d7d7e34362b00c562fc82"/>
+    <w:p>
+      <w:pPr>
+        <w:pStyle w:val="Heading4"/>
+      </w:pPr>
+      <w:r>
+        <w:t xml:space="preserve">Before you run the installation script (Decision on Plugin to install)</w:t>
+      </w:r>
+    </w:p>
+    <w:p>
+      <w:pPr>
+        <w:pStyle w:val="FirstParagraph"/>
+      </w:pPr>
+      <w:r>
+        <w:t xml:space="preserve">Before you run the installation script, you should decide which plugin you want to install, In the context of this guide this typically means which ID System you want to integrate with. Based on your decision, you should navigate to the respective folder and run the installation script.</w:t>
+      </w:r>
+      <w:r>
+        <w:t xml:space="preserve"> </w:t>
+      </w:r>
+    </w:p>
+    <w:p>
+      <w:pPr>
+        <w:pStyle w:val="Compact"/>
+        <w:numPr>
+          <w:ilvl w:val="0"/>
+          <w:numId w:val="1021"/>
+        </w:numPr>
+      </w:pPr>
       <w:r>
         <w:rPr>
           <w:b/>
           <w:bCs/>
         </w:rPr>
-        <w:t xml:space="preserve">Warning message to be shown:</w:t>
-      </w:r>
-      <w:r>
-        <w:t xml:space="preserve"> </w:t>
-      </w:r>
-      <w:r>
-        <w:t xml:space="preserve">“It is not recommended to use the eSignet without captcha site key and captcha secret key in production env. Press enter to proceed”</w:t>
-      </w:r>
-      <w:r>
-        <w:t xml:space="preserve"> </w:t>
-      </w:r>
+        <w:t xml:space="preserve">eSignet Mock Plugin</w:t>
+      </w:r>
+      <w:r>
+        <w:t xml:space="preserve"> </w:t>
+      </w:r>
+      <w:r>
+        <w:t xml:space="preserve">– Simulates an identity provider for testing and development; no real ID system integration required.</w:t>
+      </w:r>
+    </w:p>
+    <w:p>
+      <w:pPr>
+        <w:pStyle w:val="Compact"/>
+        <w:numPr>
+          <w:ilvl w:val="0"/>
+          <w:numId w:val="1021"/>
+        </w:numPr>
+      </w:pPr>
       <w:r>
         <w:rPr>
           <w:b/>
           <w:bCs/>
         </w:rPr>
-        <w:t xml:space="preserve">Prompts</w:t>
-      </w:r>
-      <w:r>
-        <w:t xml:space="preserve">:</w:t>
-      </w:r>
-      <w:r>
-        <w:t xml:space="preserve"> </w:t>
-      </w:r>
-      <w:r>
-        <w:t xml:space="preserve">1. y - If you want to install captcha validation service,</w:t>
-      </w:r>
-      <w:r>
-        <w:t xml:space="preserve"> </w:t>
-      </w:r>
+        <w:t xml:space="preserve">MOSIP Identity Plugin</w:t>
+      </w:r>
+      <w:r>
+        <w:t xml:space="preserve"> </w:t>
+      </w:r>
+      <w:r>
+        <w:t xml:space="preserve">– Integrates eSignet with an existing MOSIP identity system.</w:t>
+      </w:r>
+    </w:p>
+    <w:p>
+      <w:pPr>
+        <w:pStyle w:val="Compact"/>
+        <w:numPr>
+          <w:ilvl w:val="0"/>
+          <w:numId w:val="1021"/>
+        </w:numPr>
+      </w:pPr>
       <w:r>
         <w:rPr>
           <w:b/>
           <w:bCs/>
         </w:rPr>
-        <w:t xml:space="preserve">The below set of questions [c-d] should be prompted only when the answer to the above is</w:t>
-      </w:r>
+        <w:t xml:space="preserve">Sunbird RC Plugin</w:t>
+      </w:r>
+      <w:r>
+        <w:t xml:space="preserve"> </w:t>
+      </w:r>
+      <w:r>
+        <w:t xml:space="preserve">– Connects eSignet to an existing Sunbird RC identity registry.</w:t>
+      </w:r>
+    </w:p>
+    <w:p>
+      <w:pPr>
+        <w:pStyle w:val="Compact"/>
+        <w:numPr>
+          <w:ilvl w:val="0"/>
+          <w:numId w:val="1021"/>
+        </w:numPr>
+      </w:pPr>
       <w:r>
         <w:rPr>
           <w:b/>
           <w:bCs/>
         </w:rPr>
-        <w:t xml:space="preserve"> </w:t>
-      </w:r>
-      <w:r>
-        <w:rPr>
-          <w:b/>
-          <w:bCs/>
-        </w:rPr>
-        <w:t xml:space="preserve">‘y’</w:t>
-      </w:r>
-      <w:r>
-        <w:rPr>
-          <w:b/>
-          <w:bCs/>
-        </w:rPr>
-        <w:t xml:space="preserve">.</w:t>
-      </w:r>
-    </w:p>
-    <w:p>
-      <w:pPr>
-        <w:pStyle w:val="SourceCode"/>
-      </w:pPr>
-      <w:r>
-        <w:rPr>
-          <w:rStyle w:val="VerbatimChar"/>
-        </w:rPr>
-        <w:t xml:space="preserve">1.  ["captchasitekey"] = "Please provide the captcha site key"</w:t>
-      </w:r>
-      <w:r>
-        <w:br/>
-      </w:r>
-      <w:r>
-        <w:br/>
-      </w:r>
-      <w:r>
-        <w:rPr>
-          <w:rStyle w:val="VerbatimChar"/>
-        </w:rPr>
-        <w:t xml:space="preserve">2.  ["captchasecretkey"] = "Please provide the captcha secret key"</w:t>
-      </w:r>
-      <w:r>
-        <w:br/>
-      </w:r>
-      <w:r>
-        <w:br/>
-      </w:r>
-      <w:r>
-        <w:rPr>
-          <w:rStyle w:val="VerbatimChar"/>
-        </w:rPr>
-        <w:t xml:space="preserve">3.  If opted 'n' what needs to be done &lt;!-- explain --&gt;</w:t>
-      </w:r>
-    </w:p>
-    <w:p>
-      <w:pPr>
-        <w:pStyle w:val="FirstParagraph"/>
-      </w:pPr>
-      <w:r>
-        <w:t xml:space="preserve">Pre-requisite installation is complete at this stage.</w:t>
-      </w:r>
-    </w:p>
-    <w:bookmarkEnd w:id="44"/>
-    <w:bookmarkEnd w:id="45"/>
-    <w:bookmarkStart w:id="46" w:name="initialise-prerequisites"/>
-    <w:p>
-      <w:pPr>
-        <w:pStyle w:val="Heading4"/>
-      </w:pPr>
-      <w:r>
-        <w:t xml:space="preserve">Initialise Prerequisites</w:t>
-      </w:r>
-    </w:p>
-    <w:p>
-      <w:pPr>
-        <w:pStyle w:val="FirstParagraph"/>
-      </w:pPr>
-      <w:r>
-        <w:t xml:space="preserve">Run the</w:t>
-      </w:r>
-      <w:r>
-        <w:t xml:space="preserve"> </w:t>
-      </w:r>
-      <w:r>
-        <w:rPr>
-          <w:rStyle w:val="VerbatimChar"/>
-        </w:rPr>
-        <w:t xml:space="preserve">./initialise-prereq.sh</w:t>
-      </w:r>
-      <w:r>
-        <w:t xml:space="preserve"> </w:t>
-      </w:r>
-      <w:r>
-        <w:t xml:space="preserve">script (from deploy folder) to initialize required services such as the eSignet database and Keycloak. You will be prompted for configuration details based on your environment (e.g., database credentials, IAM scope, service endpoints). Update the relevant values files before executing the script to ensure correct initialization.</w:t>
-      </w:r>
-    </w:p>
-    <w:p>
-      <w:pPr>
-        <w:pStyle w:val="SourceCode"/>
-      </w:pPr>
-      <w:r>
-        <w:br/>
-      </w:r>
-      <w:r>
-        <w:rPr>
-          <w:rStyle w:val="ExtensionTok"/>
-        </w:rPr>
-        <w:t xml:space="preserve">./initialise-prereq.sh</w:t>
-      </w:r>
-    </w:p>
-    <w:p>
-      <w:pPr>
-        <w:pStyle w:val="FirstParagraph"/>
-      </w:pPr>
-      <w:r>
-        <w:t xml:space="preserve">You are prompted to answer following questions based on whether the eSignet database is present or not in the postgres server url provided above. Therefore, before you run the initialise script, update the Postgres and Keycloak values files as needed and then initialise.</w:t>
-      </w:r>
-    </w:p>
-    <w:p>
-      <w:pPr>
-        <w:numPr>
-          <w:ilvl w:val="0"/>
-          <w:numId w:val="1022"/>
-        </w:numPr>
-      </w:pPr>
-      <w:r>
-        <w:t xml:space="preserve">[</w:t>
-      </w:r>
-      <w:r>
-        <w:t xml:space="preserve">“postgres”</w:t>
-      </w:r>
-      <w:r>
-        <w:t xml:space="preserve">] =</w:t>
-      </w:r>
-      <w:r>
-        <w:t xml:space="preserve"> </w:t>
-      </w:r>
-      <w:r>
-        <w:t xml:space="preserve">“eSignet database was not found. Running the db scripts to create and initialize the eSignet database:”</w:t>
-      </w:r>
-    </w:p>
-    <w:p>
-      <w:pPr>
-        <w:numPr>
-          <w:ilvl w:val="0"/>
-          <w:numId w:val="1022"/>
-        </w:numPr>
-      </w:pPr>
-      <w:r>
-        <w:t xml:space="preserve">Information to be added in the guide for the IAM scope in the deployment guide.</w:t>
-      </w:r>
-      <w:r>
-        <w:t xml:space="preserve"> </w:t>
-      </w:r>
-    </w:p>
-    <w:p>
-      <w:pPr>
-        <w:numPr>
-          <w:ilvl w:val="0"/>
-          <w:numId w:val="1022"/>
-        </w:numPr>
-      </w:pPr>
-      <w:r>
-        <w:t xml:space="preserve">In the deployment script, certificate endpoint, binding endpoint and client management endpoint are to be configured as internal.</w:t>
-      </w:r>
-    </w:p>
-    <w:bookmarkEnd w:id="46"/>
-    <w:bookmarkEnd w:id="47"/>
-    <w:bookmarkStart w:id="61" w:name="esignet-services-installation"/>
-    <w:p>
-      <w:pPr>
-        <w:pStyle w:val="Heading3"/>
-      </w:pPr>
-      <w:r>
-        <w:t xml:space="preserve">eSignet Services Installation</w:t>
-      </w:r>
-    </w:p>
-    <w:p>
-      <w:pPr>
-        <w:pStyle w:val="FirstParagraph"/>
-      </w:pPr>
-      <w:r>
-        <w:t xml:space="preserve">Once you have completed the pre-requisite installation and initialization, you can proceed to install the eSignet services.</w:t>
-      </w:r>
-    </w:p>
-    <w:bookmarkStart w:id="57" w:name="X8b79eb935824ace5c5d7d7e34362b00c562fc82"/>
-    <w:p>
-      <w:pPr>
-        <w:pStyle w:val="Heading4"/>
-      </w:pPr>
-      <w:r>
-        <w:t xml:space="preserve">Before you run the installation script (Decision on Plugin to install)</w:t>
-      </w:r>
-    </w:p>
-    <w:p>
-      <w:pPr>
-        <w:pStyle w:val="FirstParagraph"/>
-      </w:pPr>
-      <w:r>
-        <w:t xml:space="preserve">Before you run the installation script, you should decide which plugin you want to install, In the context of this guide this typically means which ID System you want to integrate with. Based on your decision, you should navigate to the respective folder and run the installation script.</w:t>
-      </w:r>
-      <w:r>
-        <w:t xml:space="preserve"> </w:t>
-      </w:r>
-    </w:p>
-    <w:p>
-      <w:pPr>
-        <w:pStyle w:val="Compact"/>
-        <w:numPr>
-          <w:ilvl w:val="0"/>
-          <w:numId w:val="1023"/>
-        </w:numPr>
-      </w:pPr>
-      <w:r>
-        <w:rPr>
-          <w:b/>
-          <w:bCs/>
-        </w:rPr>
-        <w:t xml:space="preserve">eSignet Mock Plugin</w:t>
-      </w:r>
-      <w:r>
-        <w:t xml:space="preserve"> </w:t>
-      </w:r>
-      <w:r>
-        <w:t xml:space="preserve">– Simulates an identity provider for testing and development; no real ID system integration required.</w:t>
-      </w:r>
-    </w:p>
-    <w:p>
-      <w:pPr>
-        <w:pStyle w:val="Compact"/>
-        <w:numPr>
-          <w:ilvl w:val="0"/>
-          <w:numId w:val="1023"/>
-        </w:numPr>
-      </w:pPr>
-      <w:r>
-        <w:rPr>
-          <w:b/>
-          <w:bCs/>
-        </w:rPr>
-        <w:t xml:space="preserve">MOSIP Identity Plugin</w:t>
-      </w:r>
-      <w:r>
-        <w:t xml:space="preserve"> </w:t>
-      </w:r>
-      <w:r>
-        <w:t xml:space="preserve">– Integrates eSignet with an existing MOSIP identity system.</w:t>
-      </w:r>
-    </w:p>
-    <w:p>
-      <w:pPr>
-        <w:pStyle w:val="Compact"/>
-        <w:numPr>
-          <w:ilvl w:val="0"/>
-          <w:numId w:val="1023"/>
-        </w:numPr>
-      </w:pPr>
-      <w:r>
-        <w:rPr>
-          <w:b/>
-          <w:bCs/>
-        </w:rPr>
-        <w:t xml:space="preserve">Sunbird RC Plugin</w:t>
-      </w:r>
-      <w:r>
-        <w:t xml:space="preserve"> </w:t>
-      </w:r>
-      <w:r>
-        <w:t xml:space="preserve">– Connects eSignet to an existing Sunbird RC identity registry.</w:t>
-      </w:r>
-    </w:p>
-    <w:p>
-      <w:pPr>
-        <w:pStyle w:val="Compact"/>
-        <w:numPr>
-          <w:ilvl w:val="0"/>
-          <w:numId w:val="1023"/>
-        </w:numPr>
-      </w:pPr>
-      <w:r>
-        <w:rPr>
-          <w:b/>
-          <w:bCs/>
-        </w:rPr>
         <w:t xml:space="preserve">Custom Plugin</w:t>
       </w:r>
       <w:r>
@@ -3354,7 +3336,7 @@
         <w:t xml:space="preserve">– Enables integration with any custom identity system via API access control.</w:t>
       </w:r>
     </w:p>
-    <w:bookmarkStart w:id="52" w:name="compatibility-matrix"/>
+    <w:bookmarkStart w:id="45" w:name="compatibility-matrix"/>
     <w:p>
       <w:pPr>
         <w:pStyle w:val="Heading5"/>
@@ -3496,7 +3478,7 @@
             <w:pPr>
               <w:pStyle w:val="Compact"/>
             </w:pPr>
-            <w:hyperlink r:id="rId48">
+            <w:hyperlink r:id="rId41">
               <w:r>
                 <w:rPr>
                   <w:rStyle w:val="Hyperlink"/>
@@ -3558,7 +3540,7 @@
             <w:pPr>
               <w:pStyle w:val="Compact"/>
             </w:pPr>
-            <w:hyperlink r:id="rId49">
+            <w:hyperlink r:id="rId42">
               <w:r>
                 <w:rPr>
                   <w:rStyle w:val="Hyperlink"/>
@@ -3620,7 +3602,7 @@
             <w:pPr>
               <w:pStyle w:val="Compact"/>
             </w:pPr>
-            <w:hyperlink r:id="rId50">
+            <w:hyperlink r:id="rId43">
               <w:r>
                 <w:rPr>
                   <w:rStyle w:val="Hyperlink"/>
@@ -3682,7 +3664,7 @@
             <w:pPr>
               <w:pStyle w:val="Compact"/>
             </w:pPr>
-            <w:hyperlink r:id="rId51">
+            <w:hyperlink r:id="rId44">
               <w:r>
                 <w:rPr>
                   <w:rStyle w:val="Hyperlink"/>
@@ -3705,199 +3687,225 @@
         <w:t xml:space="preserve"> </w:t>
       </w:r>
       <w:r>
-        <w:t xml:space="preserve">‘esignet-with-plugins’</w:t>
-      </w:r>
-      <w:r>
-        <w:t xml:space="preserve"> </w:t>
-      </w:r>
-      <w:r>
-        <w:t xml:space="preserve">and run below command:</w:t>
-      </w:r>
-    </w:p>
-    <w:p>
-      <w:pPr>
-        <w:pStyle w:val="SourceCode"/>
-      </w:pPr>
-      <w:r>
-        <w:rPr>
-          <w:rStyle w:val="ExtensionTok"/>
-        </w:rPr>
-        <w:t xml:space="preserve">./install.sh</w:t>
-      </w:r>
-    </w:p>
-    <w:p>
-      <w:pPr>
-        <w:pStyle w:val="FirstParagraph"/>
-      </w:pPr>
-      <w:r>
-        <w:t xml:space="preserve">You are prompted with following question/prompts to choose from the list of available plugins and install eSignet with only chosen plugin.</w:t>
-      </w:r>
-    </w:p>
-    <w:p>
-      <w:pPr>
-        <w:numPr>
-          <w:ilvl w:val="0"/>
-          <w:numId w:val="1024"/>
-        </w:numPr>
-      </w:pPr>
-      <w:r>
-        <w:t xml:space="preserve">[</w:t>
-      </w:r>
-      <w:r>
-        <w:t xml:space="preserve">“esignetplugin”</w:t>
-      </w:r>
-      <w:r>
-        <w:t xml:space="preserve">] =</w:t>
-      </w:r>
-      <w:r>
-        <w:t xml:space="preserve"> </w:t>
-      </w:r>
-      <w:r>
-        <w:t xml:space="preserve">“Choose the required plugin to proceed with installation”</w:t>
-      </w:r>
-      <w:r>
-        <w:t xml:space="preserve">.</w:t>
-      </w:r>
-    </w:p>
-    <w:p>
-      <w:pPr>
-        <w:numPr>
-          <w:ilvl w:val="0"/>
-          <w:numId w:val="1024"/>
-        </w:numPr>
-      </w:pPr>
-      <w:r>
-        <w:t xml:space="preserve">esignet-mock-plugin</w:t>
-      </w:r>
-    </w:p>
-    <w:p>
-      <w:pPr>
-        <w:numPr>
-          <w:ilvl w:val="0"/>
-          <w:numId w:val="1024"/>
-        </w:numPr>
-      </w:pPr>
-      <w:r>
-        <w:t xml:space="preserve">mosip-identity-plugin</w:t>
-      </w:r>
-    </w:p>
-    <w:p>
-      <w:pPr>
-        <w:numPr>
-          <w:ilvl w:val="0"/>
-          <w:numId w:val="1024"/>
-        </w:numPr>
-      </w:pPr>
-      <w:r>
-        <w:t xml:space="preserve">sunbird-rc-plugin</w:t>
-      </w:r>
-    </w:p>
-    <w:p>
-      <w:pPr>
-        <w:numPr>
-          <w:ilvl w:val="0"/>
-          <w:numId w:val="1024"/>
-        </w:numPr>
-      </w:pPr>
-      <w:r>
-        <w:t xml:space="preserve">custom-plugin:”</w:t>
-      </w:r>
-    </w:p>
-    <w:p>
-      <w:pPr>
-        <w:pStyle w:val="FirstParagraph"/>
-      </w:pPr>
-      <w:r>
-        <w:t xml:space="preserve">The answer to the above questions is in option number - for example</w:t>
-      </w:r>
-      <w:r>
-        <w:t xml:space="preserve"> </w:t>
-      </w:r>
-      <w:r>
-        <w:t xml:space="preserve">‘1’</w:t>
-      </w:r>
-      <w:r>
-        <w:t xml:space="preserve">,</w:t>
-      </w:r>
-      <w:r>
-        <w:t xml:space="preserve"> </w:t>
-      </w:r>
-      <w:r>
-        <w:t xml:space="preserve">‘2’</w:t>
-      </w:r>
-      <w:r>
-        <w:t xml:space="preserve">, or</w:t>
-      </w:r>
-      <w:r>
-        <w:t xml:space="preserve"> </w:t>
-      </w:r>
-      <w:r>
-        <w:t xml:space="preserve">‘3’</w:t>
-      </w:r>
-      <w:r>
-        <w:t xml:space="preserve">.</w:t>
-      </w:r>
-    </w:p>
-    <w:bookmarkEnd w:id="52"/>
-    <w:bookmarkStart w:id="53" w:name="esignet-mock-plugin"/>
-    <w:p>
-      <w:pPr>
-        <w:pStyle w:val="Heading5"/>
-      </w:pPr>
-      <w:r>
-        <w:t xml:space="preserve">esignet-mock-plugin</w:t>
-      </w:r>
-    </w:p>
-    <w:p>
-      <w:pPr>
-        <w:pStyle w:val="FirstParagraph"/>
-      </w:pPr>
-      <w:r>
-        <w:t xml:space="preserve">If you choose</w:t>
-      </w:r>
-      <w:r>
-        <w:t xml:space="preserve"> </w:t>
-      </w:r>
-      <w:r>
-        <w:t xml:space="preserve">‘esignet-mock-plugin’</w:t>
-      </w:r>
-      <w:r>
-        <w:t xml:space="preserve">, you are not prompted any questions and the installation for mock plugin is completed automatically.</w:t>
-      </w:r>
-    </w:p>
-    <w:p>
-      <w:pPr>
-        <w:pStyle w:val="BodyText"/>
-      </w:pPr>
-      <w:r>
-        <w:t xml:space="preserve">When you choose the</w:t>
-      </w:r>
-      <w:r>
-        <w:t xml:space="preserve"> </w:t>
+        <w:t xml:space="preserve">‘</w:t>
       </w:r>
       <w:r>
         <w:rPr>
           <w:b/>
           <w:bCs/>
         </w:rPr>
+        <w:t xml:space="preserve">esignet-with-plugins</w:t>
+      </w:r>
+      <w:r>
+        <w:t xml:space="preserve">’</w:t>
+      </w:r>
+      <w:r>
+        <w:t xml:space="preserve"> </w:t>
+      </w:r>
+      <w:r>
+        <w:t xml:space="preserve">and run below command:</w:t>
+      </w:r>
+    </w:p>
+    <w:p>
+      <w:pPr>
+        <w:pStyle w:val="SourceCode"/>
+      </w:pPr>
+      <w:r>
+        <w:rPr>
+          <w:rStyle w:val="ExtensionTok"/>
+        </w:rPr>
+        <w:t xml:space="preserve">./install.sh</w:t>
+      </w:r>
+    </w:p>
+    <w:p>
+      <w:pPr>
+        <w:pStyle w:val="FirstParagraph"/>
+      </w:pPr>
+      <w:r>
+        <w:t xml:space="preserve">You are prompted with following question/prompts to choose from the list of available plugins and install eSignet with only chosen plugin.</w:t>
+      </w:r>
+    </w:p>
+    <w:p>
+      <w:pPr>
+        <w:numPr>
+          <w:ilvl w:val="0"/>
+          <w:numId w:val="1022"/>
+        </w:numPr>
+      </w:pPr>
+      <w:r>
+        <w:rPr>
+          <w:rStyle w:val="VerbatimChar"/>
+        </w:rPr>
+        <w:t xml:space="preserve">esignetplugin</w:t>
+      </w:r>
+      <w:r>
+        <w:t xml:space="preserve"> </w:t>
+      </w:r>
+      <w:r>
+        <w:t xml:space="preserve">= Choose the required plugin to proceed with installation.</w:t>
+      </w:r>
+    </w:p>
+    <w:p>
+      <w:pPr>
+        <w:numPr>
+          <w:ilvl w:val="0"/>
+          <w:numId w:val="1022"/>
+        </w:numPr>
+      </w:pPr>
+      <w:r>
         <w:t xml:space="preserve">esignet-mock-plugin</w:t>
       </w:r>
-      <w:r>
-        <w:t xml:space="preserve"> </w:t>
-      </w:r>
-      <w:r>
-        <w:t xml:space="preserve">during installation, the deployment script installs eSignet with a mock identity provider integration. This setup is primarily for testing and demonstration purposes, allowing you to simulate authentication and authorization flows without connecting to a real identity system.</w:t>
-      </w:r>
-    </w:p>
-    <w:p>
-      <w:pPr>
-        <w:pStyle w:val="BodyText"/>
-      </w:pPr>
+    </w:p>
+    <w:p>
+      <w:pPr>
+        <w:numPr>
+          <w:ilvl w:val="0"/>
+          <w:numId w:val="1022"/>
+        </w:numPr>
+      </w:pPr>
+      <w:r>
+        <w:t xml:space="preserve">mosip-identity-plugin</w:t>
+      </w:r>
+    </w:p>
+    <w:p>
+      <w:pPr>
+        <w:numPr>
+          <w:ilvl w:val="0"/>
+          <w:numId w:val="1022"/>
+        </w:numPr>
+      </w:pPr>
+      <w:r>
+        <w:t xml:space="preserve">sunbird-rc-plugin</w:t>
+      </w:r>
+    </w:p>
+    <w:p>
+      <w:pPr>
+        <w:numPr>
+          <w:ilvl w:val="0"/>
+          <w:numId w:val="1022"/>
+        </w:numPr>
+      </w:pPr>
+      <w:r>
+        <w:t xml:space="preserve">custom-plugin:”</w:t>
+      </w:r>
+    </w:p>
+    <w:p>
+      <w:pPr>
+        <w:pStyle w:val="FirstParagraph"/>
+      </w:pPr>
+      <w:r>
+        <w:t xml:space="preserve">The answer to the above questions is in option number - for example</w:t>
+      </w:r>
+      <w:r>
+        <w:t xml:space="preserve"> </w:t>
+      </w:r>
+      <w:r>
+        <w:t xml:space="preserve">‘1’</w:t>
+      </w:r>
+      <w:r>
+        <w:t xml:space="preserve">,</w:t>
+      </w:r>
+      <w:r>
+        <w:t xml:space="preserve"> </w:t>
+      </w:r>
+      <w:r>
+        <w:t xml:space="preserve">‘2’</w:t>
+      </w:r>
+      <w:r>
+        <w:t xml:space="preserve">,</w:t>
+      </w:r>
+      <w:r>
+        <w:t xml:space="preserve"> </w:t>
+      </w:r>
+      <w:r>
+        <w:t xml:space="preserve">‘3’</w:t>
+      </w:r>
+      <w:r>
+        <w:t xml:space="preserve"> </w:t>
+      </w:r>
+      <w:r>
+        <w:t xml:space="preserve">or</w:t>
+      </w:r>
+      <w:r>
+        <w:t xml:space="preserve"> </w:t>
+      </w:r>
+      <w:r>
+        <w:t xml:space="preserve">‘4’</w:t>
+      </w:r>
+      <w:r>
+        <w:t xml:space="preserve">.</w:t>
+      </w:r>
+    </w:p>
+    <w:bookmarkEnd w:id="45"/>
+    <w:bookmarkStart w:id="46" w:name="esignet-mock-plugin"/>
+    <w:p>
+      <w:pPr>
+        <w:pStyle w:val="Heading5"/>
+      </w:pPr>
+      <w:r>
+        <w:t xml:space="preserve">esignet-mock-plugin</w:t>
+      </w:r>
+    </w:p>
+    <w:p>
+      <w:pPr>
+        <w:pStyle w:val="FirstParagraph"/>
+      </w:pPr>
+      <w:r>
+        <w:t xml:space="preserve">If you choose</w:t>
+      </w:r>
+      <w:r>
+        <w:t xml:space="preserve"> </w:t>
+      </w:r>
+      <w:r>
+        <w:t xml:space="preserve">‘</w:t>
+      </w:r>
       <w:r>
         <w:rPr>
           <w:b/>
           <w:bCs/>
         </w:rPr>
+        <w:t xml:space="preserve">esignet-mock-plugin</w:t>
+      </w:r>
+      <w:r>
+        <w:t xml:space="preserve">’</w:t>
+      </w:r>
+      <w:r>
+        <w:t xml:space="preserve">, you are not prompted with any further chained questions/prompts and the installation for mock plugin is completed automatically.</w:t>
+      </w:r>
+    </w:p>
+    <w:p>
+      <w:pPr>
+        <w:pStyle w:val="BodyText"/>
+      </w:pPr>
+      <w:r>
+        <w:t xml:space="preserve">When you choose the</w:t>
+      </w:r>
+      <w:r>
+        <w:t xml:space="preserve"> </w:t>
+      </w:r>
+      <w:r>
+        <w:rPr>
+          <w:b/>
+          <w:bCs/>
+        </w:rPr>
+        <w:t xml:space="preserve">esignet-mock-plugin</w:t>
+      </w:r>
+      <w:r>
+        <w:t xml:space="preserve"> </w:t>
+      </w:r>
+      <w:r>
+        <w:t xml:space="preserve">during installation, the deployment script installs eSignet with a mock identity provider integration. This setup is primarily for testing and demonstration purposes, allowing you to simulate authentication and authorization flows without connecting to a real identity system.</w:t>
+      </w:r>
+    </w:p>
+    <w:p>
+      <w:pPr>
+        <w:pStyle w:val="BodyText"/>
+      </w:pPr>
+      <w:r>
+        <w:rPr>
+          <w:b/>
+          <w:bCs/>
+        </w:rPr>
         <w:t xml:space="preserve">Key points:</w:t>
       </w:r>
       <w:r>
@@ -3939,8 +3947,8 @@
         <w:t xml:space="preserve">After installation, you can proceed to test eSignet using the provided mock relying party tools and Postman collections.</w:t>
       </w:r>
     </w:p>
-    <w:bookmarkEnd w:id="53"/>
-    <w:bookmarkStart w:id="54" w:name="mosip-identity-plugin"/>
+    <w:bookmarkEnd w:id="46"/>
+    <w:bookmarkStart w:id="47" w:name="mosip-identity-plugin"/>
     <w:p>
       <w:pPr>
         <w:pStyle w:val="Heading5"/>
@@ -3976,217 +3984,316 @@
       <w:pPr>
         <w:numPr>
           <w:ilvl w:val="0"/>
+          <w:numId w:val="1023"/>
+        </w:numPr>
+      </w:pPr>
+      <w:r>
+        <w:t xml:space="preserve">[</w:t>
+      </w:r>
+      <w:r>
+        <w:t xml:space="preserve">“mosip.esignet.authenticator.ida.cert-url”</w:t>
+      </w:r>
+      <w:r>
+        <w:t xml:space="preserve">] =</w:t>
+      </w:r>
+      <w:r>
+        <w:t xml:space="preserve"> </w:t>
+      </w:r>
+      <w:r>
+        <w:t xml:space="preserve">“Default url: (http://mosip-file-server.mosip-file-server/mosip-certs/ida-partner.cer) Provide custom value (if applicable) to override the default url:”</w:t>
+      </w:r>
+    </w:p>
+    <w:p>
+      <w:pPr>
+        <w:numPr>
+          <w:ilvl w:val="0"/>
+          <w:numId w:val="1023"/>
+        </w:numPr>
+      </w:pPr>
+      <w:r>
+        <w:t xml:space="preserve">[</w:t>
+      </w:r>
+      <w:r>
+        <w:t xml:space="preserve">“mosip.esignet.authenticator.ida.kyc-auth-url”</w:t>
+      </w:r>
+      <w:r>
+        <w:t xml:space="preserve">] =</w:t>
+      </w:r>
+      <w:r>
+        <w:t xml:space="preserve"> </w:t>
+      </w:r>
+      <w:r>
+        <w:t xml:space="preserve">“Default url: (http://ida-auth.ida/idauthentication/v1/kyc-auth/delegated/${mosip.esignet.authenticator.ida.misp-license-key}/) Provide custom url (if applicable) to override the default url:”</w:t>
+      </w:r>
+    </w:p>
+    <w:p>
+      <w:pPr>
+        <w:numPr>
+          <w:ilvl w:val="0"/>
+          <w:numId w:val="1023"/>
+        </w:numPr>
+      </w:pPr>
+      <w:r>
+        <w:t xml:space="preserve">[</w:t>
+      </w:r>
+      <w:r>
+        <w:t xml:space="preserve">“mosip.esignet.authenticator.ida.kyc-exchange-url”</w:t>
+      </w:r>
+      <w:r>
+        <w:t xml:space="preserve">] =</w:t>
+      </w:r>
+      <w:r>
+        <w:t xml:space="preserve"> </w:t>
+      </w:r>
+      <w:r>
+        <w:t xml:space="preserve">“Default url: (http://ida-auth.ida/idauthentication/v1/kyc-exchange/delegated/${mosip.esignet.authenticator.ida.misp-license-key}/) Provide custom url (if applicable) to override the default url:”</w:t>
+      </w:r>
+    </w:p>
+    <w:p>
+      <w:pPr>
+        <w:numPr>
+          <w:ilvl w:val="0"/>
+          <w:numId w:val="1023"/>
+        </w:numPr>
+      </w:pPr>
+      <w:r>
+        <w:t xml:space="preserve">[</w:t>
+      </w:r>
+      <w:r>
+        <w:t xml:space="preserve">“mosip.esignet.authenticator.ida.send-otp-url”</w:t>
+      </w:r>
+      <w:r>
+        <w:t xml:space="preserve">] =</w:t>
+      </w:r>
+      <w:r>
+        <w:t xml:space="preserve"> </w:t>
+      </w:r>
+      <w:r>
+        <w:t xml:space="preserve">“Default url: (http://ida-otp.ida/idauthentication/v1/otp/${mosip.esignet.authenticator.ida.misp-license-key}/) Provide the custom url (if applicable) to override the default url:”</w:t>
+      </w:r>
+    </w:p>
+    <w:p>
+      <w:pPr>
+        <w:numPr>
+          <w:ilvl w:val="0"/>
+          <w:numId w:val="1023"/>
+        </w:numPr>
+      </w:pPr>
+      <w:r>
+        <w:t xml:space="preserve">[</w:t>
+      </w:r>
+      <w:r>
+        <w:t xml:space="preserve">“mosip.esignet.binder.ida.key-binding-url”</w:t>
+      </w:r>
+      <w:r>
+        <w:t xml:space="preserve">] =</w:t>
+      </w:r>
+      <w:r>
+        <w:t xml:space="preserve"> </w:t>
+      </w:r>
+      <w:r>
+        <w:t xml:space="preserve">“Default url: (http://ida-auth.ida/idauthentication/v1/identity-key-binding/delegated/${mosip.esignet.authenticator.ida.misp-license-key}/) Provide the custom url (if applicable) to override the default url:”</w:t>
+      </w:r>
+    </w:p>
+    <w:p>
+      <w:pPr>
+        <w:numPr>
+          <w:ilvl w:val="0"/>
+          <w:numId w:val="1023"/>
+        </w:numPr>
+      </w:pPr>
+      <w:r>
+        <w:t xml:space="preserve">[</w:t>
+      </w:r>
+      <w:r>
+        <w:t xml:space="preserve">“mosip.esignet.authenticator.ida.get-certificates-url”</w:t>
+      </w:r>
+      <w:r>
+        <w:t xml:space="preserve">] =</w:t>
+      </w:r>
+      <w:r>
+        <w:t xml:space="preserve"> </w:t>
+      </w:r>
+      <w:r>
+        <w:t xml:space="preserve">“Default url: (http://ida-internal.ida/idauthentication/v1/internal/getAllCertificates) Provide the custom url (if applicable) to override the default url:”</w:t>
+      </w:r>
+    </w:p>
+    <w:p>
+      <w:pPr>
+        <w:numPr>
+          <w:ilvl w:val="0"/>
+          <w:numId w:val="1023"/>
+        </w:numPr>
+      </w:pPr>
+      <w:r>
+        <w:t xml:space="preserve">[</w:t>
+      </w:r>
+      <w:r>
+        <w:t xml:space="preserve">“mosip.esignet.authenticator.ida.auth-token-url”</w:t>
+      </w:r>
+      <w:r>
+        <w:t xml:space="preserve">] =</w:t>
+      </w:r>
+      <w:r>
+        <w:t xml:space="preserve"> </w:t>
+      </w:r>
+      <w:r>
+        <w:t xml:space="preserve">“Default url: (http://authmanager.kernel/v1/authmanager/authenticate/clientidsecretkey) Provide the custom url (if applicable) to override the default url:”</w:t>
+      </w:r>
+    </w:p>
+    <w:p>
+      <w:pPr>
+        <w:numPr>
+          <w:ilvl w:val="0"/>
+          <w:numId w:val="1023"/>
+        </w:numPr>
+      </w:pPr>
+      <w:r>
+        <w:t xml:space="preserve">[</w:t>
+      </w:r>
+      <w:r>
+        <w:t xml:space="preserve">“mosip.esignet.authenticator.ida.audit-manager-url”</w:t>
+      </w:r>
+      <w:r>
+        <w:t xml:space="preserve">] =</w:t>
+      </w:r>
+      <w:r>
+        <w:t xml:space="preserve"> </w:t>
+      </w:r>
+      <w:r>
+        <w:t xml:space="preserve">“Default url: (http://auditmanager.kernel/v1/auditmanager/audits) Provide the custom url (if applicable) to override the default url:”</w:t>
+      </w:r>
+    </w:p>
+    <w:p>
+      <w:pPr>
+        <w:numPr>
+          <w:ilvl w:val="0"/>
+          <w:numId w:val="1023"/>
+        </w:numPr>
+      </w:pPr>
+      <w:r>
+        <w:t xml:space="preserve">[</w:t>
+      </w:r>
+      <w:r>
+        <w:t xml:space="preserve">“mosip.esignet.authenticator.ida.otp-channels”</w:t>
+      </w:r>
+      <w:r>
+        <w:t xml:space="preserve">] =</w:t>
+      </w:r>
+      <w:r>
+        <w:t xml:space="preserve"> </w:t>
+      </w:r>
+      <w:r>
+        <w:t xml:space="preserve">“Default channels (email,phone) Provide the required channels to override the default channels:”</w:t>
+      </w:r>
+    </w:p>
+    <w:bookmarkEnd w:id="47"/>
+    <w:bookmarkStart w:id="48" w:name="sunbird-rc-plugin"/>
+    <w:p>
+      <w:pPr>
+        <w:pStyle w:val="Heading5"/>
+      </w:pPr>
+      <w:r>
+        <w:t xml:space="preserve">sunbird-rc-plugin</w:t>
+      </w:r>
+    </w:p>
+    <w:p>
+      <w:pPr>
+        <w:pStyle w:val="FirstParagraph"/>
+      </w:pPr>
+      <w:r>
+        <w:t xml:space="preserve">If you choose</w:t>
+      </w:r>
+      <w:r>
+        <w:t xml:space="preserve"> </w:t>
+      </w:r>
+      <w:r>
+        <w:rPr>
+          <w:rStyle w:val="VerbatimChar"/>
+        </w:rPr>
+        <w:t xml:space="preserve">eSignet-with-sunbird</w:t>
+      </w:r>
+      <w:r>
+        <w:t xml:space="preserve"> </w:t>
+      </w:r>
+      <w:r>
+        <w:t xml:space="preserve">plugin, you are prompted with the question below:</w:t>
+      </w:r>
+    </w:p>
+    <w:p>
+      <w:pPr>
+        <w:pStyle w:val="Compact"/>
+        <w:numPr>
+          <w:ilvl w:val="0"/>
+          <w:numId w:val="1024"/>
+        </w:numPr>
+      </w:pPr>
+      <w:r>
+        <w:rPr>
+          <w:rStyle w:val="VerbatimChar"/>
+        </w:rPr>
+        <w:t xml:space="preserve">mosip.esignet.sunbird-rc.registry-get-url</w:t>
+      </w:r>
+      <w:r>
+        <w:t xml:space="preserve"> </w:t>
+      </w:r>
+      <w:r>
+        <w:t xml:space="preserve">= Please provide the url for sunbird registry get api:</w:t>
+      </w:r>
+    </w:p>
+    <w:p>
+      <w:pPr>
+        <w:pStyle w:val="FirstParagraph"/>
+      </w:pPr>
+      <w:r>
+        <w:t xml:space="preserve">Once the above decision inputs are taken from you, eSignet installation should be initialized and completed successfully.</w:t>
+      </w:r>
+    </w:p>
+    <w:p>
+      <w:pPr>
+        <w:pStyle w:val="BodyText"/>
+      </w:pPr>
+      <w:r>
+        <w:t xml:space="preserve">If any error occurs during eSignet installation, You can start the eSignet installation again after deleting the existing chart or fix the issue.</w:t>
+      </w:r>
+    </w:p>
+    <w:bookmarkEnd w:id="48"/>
+    <w:bookmarkStart w:id="49" w:name="custom-plugin"/>
+    <w:p>
+      <w:pPr>
+        <w:pStyle w:val="Heading5"/>
+      </w:pPr>
+      <w:r>
+        <w:t xml:space="preserve">custom-plugin</w:t>
+      </w:r>
+    </w:p>
+    <w:p>
+      <w:pPr>
+        <w:pStyle w:val="FirstParagraph"/>
+      </w:pPr>
+      <w:r>
+        <w:t xml:space="preserve">If you choose eSignet installation without plugin, below question is prompted:</w:t>
+      </w:r>
+    </w:p>
+    <w:p>
+      <w:pPr>
+        <w:pStyle w:val="Compact"/>
+        <w:numPr>
+          <w:ilvl w:val="0"/>
           <w:numId w:val="1025"/>
         </w:numPr>
       </w:pPr>
       <w:r>
-        <w:t xml:space="preserve">[</w:t>
-      </w:r>
-      <w:r>
-        <w:t xml:space="preserve">“mosip.esignet.authenticator.ida.cert-url”</w:t>
-      </w:r>
-      <w:r>
-        <w:t xml:space="preserve">] =</w:t>
-      </w:r>
-      <w:r>
-        <w:t xml:space="preserve"> </w:t>
-      </w:r>
-      <w:r>
-        <w:t xml:space="preserve">“Default url: (http://mosip-file-server.mosip-file-server/mosip-certs/ida-partner.cer) Provide custom value (if applicable) to override the default url:”</w:t>
-      </w:r>
-    </w:p>
-    <w:p>
-      <w:pPr>
-        <w:numPr>
-          <w:ilvl w:val="0"/>
-          <w:numId w:val="1025"/>
-        </w:numPr>
-      </w:pPr>
-      <w:r>
-        <w:t xml:space="preserve">[</w:t>
-      </w:r>
-      <w:r>
-        <w:t xml:space="preserve">“mosip.esignet.authenticator.ida.kyc-auth-url”</w:t>
-      </w:r>
-      <w:r>
-        <w:t xml:space="preserve">] =</w:t>
-      </w:r>
-      <w:r>
-        <w:t xml:space="preserve"> </w:t>
-      </w:r>
-      <w:r>
-        <w:t xml:space="preserve">“Default url: (http://ida-auth.ida/idauthentication/v1/kyc-auth/delegated/${mosip.esignet.authenticator.ida.misp-license-key}/) Provide custom url (if applicable) to override the default url:”</w:t>
-      </w:r>
-    </w:p>
-    <w:p>
-      <w:pPr>
-        <w:numPr>
-          <w:ilvl w:val="0"/>
-          <w:numId w:val="1025"/>
-        </w:numPr>
-      </w:pPr>
-      <w:r>
-        <w:t xml:space="preserve">[</w:t>
-      </w:r>
-      <w:r>
-        <w:t xml:space="preserve">“mosip.esignet.authenticator.ida.kyc-exchange-url”</w:t>
-      </w:r>
-      <w:r>
-        <w:t xml:space="preserve">] =</w:t>
-      </w:r>
-      <w:r>
-        <w:t xml:space="preserve"> </w:t>
-      </w:r>
-      <w:r>
-        <w:t xml:space="preserve">“Default url: (http://ida-auth.ida/idauthentication/v1/kyc-exchange/delegated/${mosip.esignet.authenticator.ida.misp-license-key}/) Provide custom url (if applicable) to override the default url:”</w:t>
-      </w:r>
-    </w:p>
-    <w:p>
-      <w:pPr>
-        <w:numPr>
-          <w:ilvl w:val="0"/>
-          <w:numId w:val="1025"/>
-        </w:numPr>
-      </w:pPr>
-      <w:r>
-        <w:t xml:space="preserve">[</w:t>
-      </w:r>
-      <w:r>
-        <w:t xml:space="preserve">“mosip.esignet.authenticator.ida.send-otp-url”</w:t>
-      </w:r>
-      <w:r>
-        <w:t xml:space="preserve">] =</w:t>
-      </w:r>
-      <w:r>
-        <w:t xml:space="preserve"> </w:t>
-      </w:r>
-      <w:r>
-        <w:t xml:space="preserve">“Default url: (http://ida-otp.ida/idauthentication/v1/otp/${mosip.esignet.authenticator.ida.misp-license-key}/) Provide the custom url (if applicable) to override the default url:”</w:t>
-      </w:r>
-    </w:p>
-    <w:p>
-      <w:pPr>
-        <w:numPr>
-          <w:ilvl w:val="0"/>
-          <w:numId w:val="1025"/>
-        </w:numPr>
-      </w:pPr>
-      <w:r>
-        <w:t xml:space="preserve">[</w:t>
-      </w:r>
-      <w:r>
-        <w:t xml:space="preserve">“mosip.esignet.binder.ida.key-binding-url”</w:t>
-      </w:r>
-      <w:r>
-        <w:t xml:space="preserve">] =</w:t>
-      </w:r>
-      <w:r>
-        <w:t xml:space="preserve"> </w:t>
-      </w:r>
-      <w:r>
-        <w:t xml:space="preserve">“Default url: (http://ida-auth.ida/idauthentication/v1/identity-key-binding/delegated/${mosip.esignet.authenticator.ida.misp-license-key}/) Provide the custom url (if applicable) to override the default url:”</w:t>
-      </w:r>
-    </w:p>
-    <w:p>
-      <w:pPr>
-        <w:numPr>
-          <w:ilvl w:val="0"/>
-          <w:numId w:val="1025"/>
-        </w:numPr>
-      </w:pPr>
-      <w:r>
-        <w:t xml:space="preserve">[</w:t>
-      </w:r>
-      <w:r>
-        <w:t xml:space="preserve">“mosip.esignet.authenticator.ida.get-certificates-url”</w:t>
-      </w:r>
-      <w:r>
-        <w:t xml:space="preserve">] =</w:t>
-      </w:r>
-      <w:r>
-        <w:t xml:space="preserve"> </w:t>
-      </w:r>
-      <w:r>
-        <w:t xml:space="preserve">“Default url: (http://ida-internal.ida/idauthentication/v1/internal/getAllCertificates) Provide the custom url (if applicable) to override the default url:”</w:t>
-      </w:r>
-    </w:p>
-    <w:p>
-      <w:pPr>
-        <w:numPr>
-          <w:ilvl w:val="0"/>
-          <w:numId w:val="1025"/>
-        </w:numPr>
-      </w:pPr>
-      <w:r>
-        <w:t xml:space="preserve">[</w:t>
-      </w:r>
-      <w:r>
-        <w:t xml:space="preserve">“mosip.esignet.authenticator.ida.auth-token-url”</w:t>
-      </w:r>
-      <w:r>
-        <w:t xml:space="preserve">] =</w:t>
-      </w:r>
-      <w:r>
-        <w:t xml:space="preserve"> </w:t>
-      </w:r>
-      <w:r>
-        <w:t xml:space="preserve">“Default url: (http://authmanager.kernel/v1/authmanager/authenticate/clientidsecretkey) Provide the custom url (if applicable) to override the default url:”</w:t>
-      </w:r>
-    </w:p>
-    <w:p>
-      <w:pPr>
-        <w:numPr>
-          <w:ilvl w:val="0"/>
-          <w:numId w:val="1025"/>
-        </w:numPr>
-      </w:pPr>
-      <w:r>
-        <w:t xml:space="preserve">[</w:t>
-      </w:r>
-      <w:r>
-        <w:t xml:space="preserve">“mosip.esignet.authenticator.ida.audit-manager-url”</w:t>
-      </w:r>
-      <w:r>
-        <w:t xml:space="preserve">] =</w:t>
-      </w:r>
-      <w:r>
-        <w:t xml:space="preserve"> </w:t>
-      </w:r>
-      <w:r>
-        <w:t xml:space="preserve">“Default url: (http://auditmanager.kernel/v1/auditmanager/audits) Provide the custom url (if applicable) to override the default url:”</w:t>
-      </w:r>
-    </w:p>
-    <w:p>
-      <w:pPr>
-        <w:numPr>
-          <w:ilvl w:val="0"/>
-          <w:numId w:val="1025"/>
-        </w:numPr>
-      </w:pPr>
-      <w:r>
-        <w:t xml:space="preserve">[</w:t>
-      </w:r>
-      <w:r>
-        <w:t xml:space="preserve">“mosip.esignet.authenticator.ida.otp-channels”</w:t>
-      </w:r>
-      <w:r>
-        <w:t xml:space="preserve">] =</w:t>
-      </w:r>
-      <w:r>
-        <w:t xml:space="preserve"> </w:t>
-      </w:r>
-      <w:r>
-        <w:t xml:space="preserve">“Default channels (email,phone) Provide the required channels to override the default channels:”</w:t>
-      </w:r>
-    </w:p>
-    <w:bookmarkEnd w:id="54"/>
-    <w:bookmarkStart w:id="55" w:name="sunbird-rc-plugin"/>
-    <w:p>
-      <w:pPr>
-        <w:pStyle w:val="Heading5"/>
-      </w:pPr>
-      <w:r>
-        <w:t xml:space="preserve">sunbird-rc-plugin</w:t>
+        <w:rPr>
+          <w:rStyle w:val="VerbatimChar"/>
+        </w:rPr>
+        <w:t xml:space="preserve">custompluginurl</w:t>
+      </w:r>
+      <w:r>
+        <w:t xml:space="preserve"> </w:t>
+      </w:r>
+      <w:r>
+        <w:t xml:space="preserve">= Please provide the url for the custom plugin you want to use:</w:t>
       </w:r>
     </w:p>
     <w:p>
@@ -4194,22 +4301,150 @@
         <w:pStyle w:val="FirstParagraph"/>
       </w:pPr>
       <w:r>
-        <w:t xml:space="preserve">If you choose</w:t>
-      </w:r>
-      <w:r>
-        <w:t xml:space="preserve"> </w:t>
-      </w:r>
+        <w:t xml:space="preserve">Above url can be zip file or jar file, so both zip url and jar file url are supported for above variable.</w:t>
+      </w:r>
+    </w:p>
+    <w:p>
+      <w:pPr>
+        <w:pStyle w:val="BodyText"/>
+      </w:pPr>
+      <w:r>
+        <w:t xml:space="preserve">Once the above input are taken from you, eSignet installation is initialised and completed successfully.</w:t>
+      </w:r>
+    </w:p>
+    <w:p>
+      <w:pPr>
+        <w:pStyle w:val="BodyText"/>
+      </w:pPr>
+      <w:r>
+        <w:t xml:space="preserve">If any error occurs during eSignet installation, you are able to start the eSignet installation again after deleting the existing helm chart using delete.sh or debug the issue further.</w:t>
+      </w:r>
+    </w:p>
+    <w:bookmarkEnd w:id="49"/>
+    <w:bookmarkEnd w:id="50"/>
+    <w:bookmarkStart w:id="51" w:name="oidc-ui-installation"/>
+    <w:p>
+      <w:pPr>
+        <w:pStyle w:val="Heading4"/>
+      </w:pPr>
+      <w:r>
+        <w:t xml:space="preserve">OIDC UI Installation</w:t>
+      </w:r>
+    </w:p>
+    <w:p>
+      <w:pPr>
+        <w:pStyle w:val="FirstParagraph"/>
+      </w:pPr>
+      <w:r>
+        <w:t xml:space="preserve">Once eSignet installation is completed, now, you are prompted to provide relevant inputs for completing oidc ui deployment:</w:t>
+      </w:r>
+    </w:p>
+    <w:p>
+      <w:pPr>
+        <w:numPr>
+          <w:ilvl w:val="0"/>
+          <w:numId w:val="1026"/>
+        </w:numPr>
+      </w:pPr>
       <w:r>
         <w:rPr>
           <w:rStyle w:val="VerbatimChar"/>
         </w:rPr>
-        <w:t xml:space="preserve">eSignet-with-sunbird</w:t>
-      </w:r>
-      <w:r>
-        <w:t xml:space="preserve"> </w:t>
-      </w:r>
-      <w:r>
-        <w:t xml:space="preserve">plugin, you are prompted with the question below:</w:t>
+        <w:t xml:space="preserve">esignetthemes</w:t>
+      </w:r>
+      <w:r>
+        <w:t xml:space="preserve"> </w:t>
+      </w:r>
+      <w:r>
+        <w:t xml:space="preserve">= Please provide the theme for the eSignet UI. Please choose between</w:t>
+      </w:r>
+      <w:r>
+        <w:t xml:space="preserve"> </w:t>
+      </w:r>
+      <w:r>
+        <w:t xml:space="preserve">‘blue’</w:t>
+      </w:r>
+      <w:r>
+        <w:t xml:space="preserve"> </w:t>
+      </w:r>
+      <w:r>
+        <w:t xml:space="preserve">or</w:t>
+      </w:r>
+      <w:r>
+        <w:t xml:space="preserve"> </w:t>
+      </w:r>
+      <w:r>
+        <w:t xml:space="preserve">‘orange’</w:t>
+      </w:r>
+      <w:r>
+        <w:t xml:space="preserve"> </w:t>
+      </w:r>
+      <w:r>
+        <w:t xml:space="preserve">for esignet default theme: Press enter for the default theme. Please provide URL for the custom theme”</w:t>
+      </w:r>
+    </w:p>
+    <w:p>
+      <w:pPr>
+        <w:numPr>
+          <w:ilvl w:val="0"/>
+          <w:numId w:val="1026"/>
+        </w:numPr>
+      </w:pPr>
+      <w:r>
+        <w:rPr>
+          <w:rStyle w:val="VerbatimChar"/>
+        </w:rPr>
+        <w:t xml:space="preserve">defaultlang</w:t>
+      </w:r>
+      <w:r>
+        <w:t xml:space="preserve"> </w:t>
+      </w:r>
+      <w:r>
+        <w:t xml:space="preserve">= Please choose the default lang for esignet. Please press enter for en: ”</w:t>
+      </w:r>
+      <w:r>
+        <w:t xml:space="preserve"> </w:t>
+      </w:r>
+      <w:r>
+        <w:t xml:space="preserve">- We should provide the existing list.</w:t>
+      </w:r>
+    </w:p>
+    <w:p>
+      <w:pPr>
+        <w:numPr>
+          <w:ilvl w:val="0"/>
+          <w:numId w:val="1026"/>
+        </w:numPr>
+      </w:pPr>
+      <w:r>
+        <w:rPr>
+          <w:rStyle w:val="VerbatimChar"/>
+        </w:rPr>
+        <w:t xml:space="preserve">idprovidername</w:t>
+      </w:r>
+      <w:r>
+        <w:t xml:space="preserve"> </w:t>
+      </w:r>
+      <w:r>
+        <w:t xml:space="preserve">= Please provide the name for eSignet: (Note: This name will be used instead of eSignet on the login page and in other places)”</w:t>
+      </w:r>
+    </w:p>
+    <w:bookmarkEnd w:id="51"/>
+    <w:bookmarkStart w:id="53" w:name="mock-relying-party-installation"/>
+    <w:p>
+      <w:pPr>
+        <w:pStyle w:val="Heading4"/>
+      </w:pPr>
+      <w:r>
+        <w:t xml:space="preserve">Mock Relying Party Installation</w:t>
+      </w:r>
+    </w:p>
+    <w:p>
+      <w:pPr>
+        <w:pStyle w:val="FirstParagraph"/>
+      </w:pPr>
+      <w:r>
+        <w:t xml:space="preserve">If you have chosen to install eSignet with mosip ID then the MISP onboarding should be initiated and completed successfully, however if you choose to continue with mock or custom plugin, no MISP onboarding is required, and this step should be skipped.</w:t>
       </w:r>
     </w:p>
     <w:p>
@@ -4217,23 +4452,23 @@
         <w:pStyle w:val="Compact"/>
         <w:numPr>
           <w:ilvl w:val="0"/>
-          <w:numId w:val="1026"/>
-        </w:numPr>
-      </w:pPr>
-      <w:r>
-        <w:t xml:space="preserve">[</w:t>
-      </w:r>
-      <w:r>
-        <w:t xml:space="preserve">“mosip.esignet.sunbird-rc.registry-get-url”</w:t>
-      </w:r>
-      <w:r>
-        <w:t xml:space="preserve">] =</w:t>
-      </w:r>
-      <w:r>
-        <w:t xml:space="preserve"> </w:t>
-      </w:r>
-      <w:r>
-        <w:t xml:space="preserve">“Please provide the url for sunbird registry get api:”</w:t>
+          <w:numId w:val="1027"/>
+        </w:numPr>
+      </w:pPr>
+      <w:r>
+        <w:t xml:space="preserve">Use the onboarder script to register eSignet as a MISP partner and configure the OIDC client.</w:t>
+      </w:r>
+    </w:p>
+    <w:p>
+      <w:pPr>
+        <w:pStyle w:val="Compact"/>
+        <w:numPr>
+          <w:ilvl w:val="0"/>
+          <w:numId w:val="1027"/>
+        </w:numPr>
+      </w:pPr>
+      <w:r>
+        <w:t xml:space="preserve">Update any required properties (e.g., MOSIP IDA domain names, client secrets) as per your environment.</w:t>
       </w:r>
     </w:p>
     <w:p>
@@ -4241,254 +4476,12 @@
         <w:pStyle w:val="FirstParagraph"/>
       </w:pPr>
       <w:r>
-        <w:t xml:space="preserve">Once the above decision inputs are taken from you, eSignet installation should be initialized and completed successfully.</w:t>
-      </w:r>
-    </w:p>
-    <w:p>
-      <w:pPr>
-        <w:pStyle w:val="BodyText"/>
-      </w:pPr>
-      <w:r>
-        <w:t xml:space="preserve">If any error occurs during eSignet installation, You can start the eSignet installation again after deleting the existing chart or fix the issue.</w:t>
-      </w:r>
-    </w:p>
-    <w:bookmarkEnd w:id="55"/>
-    <w:bookmarkStart w:id="56" w:name="custom-plugin"/>
-    <w:p>
-      <w:pPr>
-        <w:pStyle w:val="Heading5"/>
-      </w:pPr>
-      <w:r>
-        <w:t xml:space="preserve">custom-plugin</w:t>
-      </w:r>
-    </w:p>
-    <w:p>
-      <w:pPr>
-        <w:pStyle w:val="FirstParagraph"/>
-      </w:pPr>
-      <w:r>
-        <w:t xml:space="preserve">If you choose eSignet installation without plugin, below question is prompted:</w:t>
-      </w:r>
-    </w:p>
-    <w:p>
-      <w:pPr>
-        <w:pStyle w:val="Compact"/>
-        <w:numPr>
-          <w:ilvl w:val="0"/>
-          <w:numId w:val="1027"/>
-        </w:numPr>
-      </w:pPr>
-      <w:r>
-        <w:t xml:space="preserve">[</w:t>
-      </w:r>
-      <w:r>
-        <w:t xml:space="preserve">“custompluginurl”</w:t>
-      </w:r>
-      <w:r>
-        <w:t xml:space="preserve">] =</w:t>
-      </w:r>
-      <w:r>
-        <w:t xml:space="preserve"> </w:t>
-      </w:r>
-      <w:r>
-        <w:t xml:space="preserve">“Please provide the url for the custom plugin you want to use:”</w:t>
-      </w:r>
-    </w:p>
-    <w:p>
-      <w:pPr>
-        <w:pStyle w:val="FirstParagraph"/>
-      </w:pPr>
-      <w:r>
-        <w:t xml:space="preserve">Above url can be zip file or jar file, so both zip url and jar file url are supported for above variable.</w:t>
-      </w:r>
-    </w:p>
-    <w:p>
-      <w:pPr>
-        <w:pStyle w:val="BodyText"/>
-      </w:pPr>
-      <w:r>
-        <w:t xml:space="preserve">Once the above input are taken from you, eSignet installation is initialised and completed successfully.</w:t>
-      </w:r>
-    </w:p>
-    <w:p>
-      <w:pPr>
-        <w:pStyle w:val="BodyText"/>
-      </w:pPr>
-      <w:r>
-        <w:t xml:space="preserve">If any error occurs during eSignet installation, you are able to start the eSignet installation again after deleting the existing helm chart using delete.sh or debug the issue further.</w:t>
-      </w:r>
-    </w:p>
-    <w:bookmarkEnd w:id="56"/>
-    <w:bookmarkEnd w:id="57"/>
-    <w:bookmarkStart w:id="58" w:name="oidc-ui-installation"/>
-    <w:p>
-      <w:pPr>
-        <w:pStyle w:val="Heading4"/>
-      </w:pPr>
-      <w:r>
-        <w:t xml:space="preserve">OIDC UI Installation</w:t>
-      </w:r>
-    </w:p>
-    <w:p>
-      <w:pPr>
-        <w:pStyle w:val="FirstParagraph"/>
-      </w:pPr>
-      <w:r>
-        <w:t xml:space="preserve">Once eSignet installation is completed, now, you are prompted to provide relevant inputs for completing oidc ui deployment:</w:t>
-      </w:r>
-    </w:p>
-    <w:p>
-      <w:pPr>
-        <w:numPr>
-          <w:ilvl w:val="0"/>
-          <w:numId w:val="1028"/>
-        </w:numPr>
-      </w:pPr>
-      <w:r>
-        <w:t xml:space="preserve">[</w:t>
-      </w:r>
-      <w:r>
-        <w:t xml:space="preserve">“esignetthemes”</w:t>
-      </w:r>
-      <w:r>
-        <w:t xml:space="preserve">] =</w:t>
-      </w:r>
-      <w:r>
-        <w:t xml:space="preserve"> </w:t>
-      </w:r>
-      <w:r>
-        <w:t xml:space="preserve">“Please provide the theme for the eSignet UI. Please choose between</w:t>
-      </w:r>
-      <w:r>
-        <w:t xml:space="preserve"> </w:t>
-      </w:r>
-      <w:r>
-        <w:t xml:space="preserve">‘blue’</w:t>
-      </w:r>
-      <w:r>
-        <w:t xml:space="preserve"> </w:t>
-      </w:r>
-      <w:r>
-        <w:t xml:space="preserve">or</w:t>
-      </w:r>
-      <w:r>
-        <w:t xml:space="preserve"> </w:t>
-      </w:r>
-      <w:r>
-        <w:t xml:space="preserve">‘orange’</w:t>
-      </w:r>
-      <w:r>
-        <w:t xml:space="preserve"> </w:t>
-      </w:r>
-      <w:r>
-        <w:t xml:space="preserve">for esignet default theme: Press enter for the default theme. Please provide URL for the custom theme”</w:t>
-      </w:r>
-    </w:p>
-    <w:p>
-      <w:pPr>
-        <w:numPr>
-          <w:ilvl w:val="0"/>
-          <w:numId w:val="1028"/>
-        </w:numPr>
-      </w:pPr>
-      <w:r>
-        <w:t xml:space="preserve">[</w:t>
-      </w:r>
-      <w:r>
-        <w:t xml:space="preserve">“defaultlang”</w:t>
-      </w:r>
-      <w:r>
-        <w:t xml:space="preserve">] =</w:t>
-      </w:r>
-      <w:r>
-        <w:t xml:space="preserve"> </w:t>
-      </w:r>
-      <w:r>
-        <w:t xml:space="preserve">“Please choose the default lang for esignet. Please press enter for en:”</w:t>
-      </w:r>
-      <w:r>
-        <w:t xml:space="preserve"> </w:t>
-      </w:r>
-      <w:r>
-        <w:t xml:space="preserve">- We should provide the existing list.</w:t>
-      </w:r>
-    </w:p>
-    <w:p>
-      <w:pPr>
-        <w:numPr>
-          <w:ilvl w:val="0"/>
-          <w:numId w:val="1028"/>
-        </w:numPr>
-      </w:pPr>
-      <w:r>
-        <w:t xml:space="preserve">[</w:t>
-      </w:r>
-      <w:r>
-        <w:t xml:space="preserve">“idprovidername”</w:t>
-      </w:r>
-      <w:r>
-        <w:t xml:space="preserve">] =</w:t>
-      </w:r>
-      <w:r>
-        <w:t xml:space="preserve"> </w:t>
-      </w:r>
-      <w:r>
-        <w:t xml:space="preserve">“Please provide the name for eSignet: (Note: This name will be used instead of eSignet on the login page and in other places)”</w:t>
-      </w:r>
-    </w:p>
-    <w:bookmarkEnd w:id="58"/>
-    <w:bookmarkStart w:id="60" w:name="mock-relying-party-installation"/>
-    <w:p>
-      <w:pPr>
-        <w:pStyle w:val="Heading4"/>
-      </w:pPr>
-      <w:r>
-        <w:t xml:space="preserve">Mock Relying Party Installation</w:t>
-      </w:r>
-    </w:p>
-    <w:p>
-      <w:pPr>
-        <w:pStyle w:val="FirstParagraph"/>
-      </w:pPr>
-      <w:r>
-        <w:t xml:space="preserve">If you have chosen to install eSignet with mosip ID then the MISP onboarding should be initiated and completed successfully, however if you choose to continue with mock or custom plugin no MISP onboarding is required, and this step should be skipped.</w:t>
-      </w:r>
-    </w:p>
-    <w:p>
-      <w:pPr>
-        <w:pStyle w:val="Compact"/>
-        <w:numPr>
-          <w:ilvl w:val="0"/>
-          <w:numId w:val="1029"/>
-        </w:numPr>
-      </w:pPr>
-      <w:r>
-        <w:t xml:space="preserve">Use the onboarder script to register eSignet as a MISP partner and configure the OIDC client.</w:t>
-      </w:r>
-    </w:p>
-    <w:p>
-      <w:pPr>
-        <w:pStyle w:val="Compact"/>
-        <w:numPr>
-          <w:ilvl w:val="0"/>
-          <w:numId w:val="1029"/>
-        </w:numPr>
-      </w:pPr>
-      <w:r>
-        <w:t xml:space="preserve">Update any required properties (e.g., MOSIP IDA domain names, client secrets) as per your environment.</w:t>
-      </w:r>
-    </w:p>
-    <w:p>
-      <w:pPr>
-        <w:pStyle w:val="FirstParagraph"/>
-      </w:pPr>
-      <w:r>
         <w:t xml:space="preserve">Refer to the</w:t>
       </w:r>
       <w:r>
         <w:t xml:space="preserve"> </w:t>
       </w:r>
-      <w:hyperlink r:id="rId59">
+      <w:hyperlink r:id="rId52">
         <w:r>
           <w:rPr>
             <w:rStyle w:val="Hyperlink"/>
@@ -4519,10 +4512,10 @@
         <w:t xml:space="preserve">Note: You can refer to the deployment guide to know more about the mock relying party portal installation, having mock relying party portal installed will be helpful to verify the complete eSignet flow.</w:t>
       </w:r>
     </w:p>
-    <w:bookmarkEnd w:id="60"/>
-    <w:bookmarkEnd w:id="61"/>
-    <w:bookmarkEnd w:id="62"/>
-    <w:bookmarkStart w:id="63" w:name="verify-deployment"/>
+    <w:bookmarkEnd w:id="53"/>
+    <w:bookmarkEnd w:id="54"/>
+    <w:bookmarkEnd w:id="55"/>
+    <w:bookmarkStart w:id="56" w:name="verify-deployment"/>
     <w:p>
       <w:pPr>
         <w:pStyle w:val="Heading2"/>
@@ -4589,8 +4582,30 @@
         <w:t xml:space="preserve"> </w:t>
       </w:r>
     </w:p>
-    <w:bookmarkEnd w:id="63"/>
-    <w:bookmarkEnd w:id="64"/>
+    <w:bookmarkEnd w:id="56"/>
+    <w:bookmarkEnd w:id="57"/>
+    <w:bookmarkStart w:id="58" w:name="documentation"/>
+    <w:p>
+      <w:pPr>
+        <w:pStyle w:val="Heading1"/>
+      </w:pPr>
+      <w:r>
+        <w:t xml:space="preserve">Documentation</w:t>
+      </w:r>
+    </w:p>
+    <w:p>
+      <w:pPr>
+        <w:pStyle w:val="Compact"/>
+        <w:numPr>
+          <w:ilvl w:val="0"/>
+          <w:numId w:val="1028"/>
+        </w:numPr>
+      </w:pPr>
+      <w:r>
+        <w:t xml:space="preserve">Integrations and Configurations topics</w:t>
+      </w:r>
+    </w:p>
+    <w:bookmarkEnd w:id="58"/>
     <w:sectPr>
       <w:footnotePr>
         <w:numRestart w:val="eachSect"/>
@@ -5038,10 +5053,64 @@
     <w:abstractNumId w:val="991"/>
   </w:num>
   <w:num w:numId="1012">
-    <w:abstractNumId w:val="991"/>
+    <w:abstractNumId w:val="99411"/>
+    <w:lvlOverride w:ilvl="0">
+      <w:startOverride w:val="1"/>
+    </w:lvlOverride>
+    <w:lvlOverride w:ilvl="1">
+      <w:startOverride w:val="1"/>
+    </w:lvlOverride>
+    <w:lvlOverride w:ilvl="2">
+      <w:startOverride w:val="1"/>
+    </w:lvlOverride>
+    <w:lvlOverride w:ilvl="3">
+      <w:startOverride w:val="1"/>
+    </w:lvlOverride>
+    <w:lvlOverride w:ilvl="4">
+      <w:startOverride w:val="1"/>
+    </w:lvlOverride>
+    <w:lvlOverride w:ilvl="5">
+      <w:startOverride w:val="1"/>
+    </w:lvlOverride>
+    <w:lvlOverride w:ilvl="6">
+      <w:startOverride w:val="1"/>
+    </w:lvlOverride>
+    <w:lvlOverride w:ilvl="7">
+      <w:startOverride w:val="1"/>
+    </w:lvlOverride>
+    <w:lvlOverride w:ilvl="8">
+      <w:startOverride w:val="1"/>
+    </w:lvlOverride>
   </w:num>
   <w:num w:numId="1013">
-    <w:abstractNumId w:val="991"/>
+    <w:abstractNumId w:val="99412"/>
+    <w:lvlOverride w:ilvl="0">
+      <w:startOverride w:val="2"/>
+    </w:lvlOverride>
+    <w:lvlOverride w:ilvl="1">
+      <w:startOverride w:val="2"/>
+    </w:lvlOverride>
+    <w:lvlOverride w:ilvl="2">
+      <w:startOverride w:val="2"/>
+    </w:lvlOverride>
+    <w:lvlOverride w:ilvl="3">
+      <w:startOverride w:val="2"/>
+    </w:lvlOverride>
+    <w:lvlOverride w:ilvl="4">
+      <w:startOverride w:val="2"/>
+    </w:lvlOverride>
+    <w:lvlOverride w:ilvl="5">
+      <w:startOverride w:val="2"/>
+    </w:lvlOverride>
+    <w:lvlOverride w:ilvl="6">
+      <w:startOverride w:val="2"/>
+    </w:lvlOverride>
+    <w:lvlOverride w:ilvl="7">
+      <w:startOverride w:val="2"/>
+    </w:lvlOverride>
+    <w:lvlOverride w:ilvl="8">
+      <w:startOverride w:val="2"/>
+    </w:lvlOverride>
   </w:num>
   <w:num w:numId="1014">
     <w:abstractNumId w:val="991"/>
@@ -5077,37 +5146,64 @@
     </w:lvlOverride>
   </w:num>
   <w:num w:numId="1016">
-    <w:abstractNumId w:val="99412"/>
+    <w:abstractNumId w:val="99411"/>
     <w:lvlOverride w:ilvl="0">
-      <w:startOverride w:val="2"/>
+      <w:startOverride w:val="1"/>
     </w:lvlOverride>
     <w:lvlOverride w:ilvl="1">
-      <w:startOverride w:val="2"/>
+      <w:startOverride w:val="1"/>
     </w:lvlOverride>
     <w:lvlOverride w:ilvl="2">
-      <w:startOverride w:val="2"/>
+      <w:startOverride w:val="1"/>
     </w:lvlOverride>
     <w:lvlOverride w:ilvl="3">
-      <w:startOverride w:val="2"/>
+      <w:startOverride w:val="1"/>
     </w:lvlOverride>
     <w:lvlOverride w:ilvl="4">
-      <w:startOverride w:val="2"/>
+      <w:startOverride w:val="1"/>
     </w:lvlOverride>
     <w:lvlOverride w:ilvl="5">
-      <w:startOverride w:val="2"/>
+      <w:startOverride w:val="1"/>
     </w:lvlOverride>
     <w:lvlOverride w:ilvl="6">
-      <w:startOverride w:val="2"/>
+      <w:startOverride w:val="1"/>
     </w:lvlOverride>
     <w:lvlOverride w:ilvl="7">
-      <w:startOverride w:val="2"/>
+      <w:startOverride w:val="1"/>
     </w:lvlOverride>
     <w:lvlOverride w:ilvl="8">
-      <w:startOverride w:val="2"/>
+      <w:startOverride w:val="1"/>
     </w:lvlOverride>
   </w:num>
   <w:num w:numId="1017">
-    <w:abstractNumId w:val="991"/>
+    <w:abstractNumId w:val="99411"/>
+    <w:lvlOverride w:ilvl="0">
+      <w:startOverride w:val="1"/>
+    </w:lvlOverride>
+    <w:lvlOverride w:ilvl="1">
+      <w:startOverride w:val="1"/>
+    </w:lvlOverride>
+    <w:lvlOverride w:ilvl="2">
+      <w:startOverride w:val="1"/>
+    </w:lvlOverride>
+    <w:lvlOverride w:ilvl="3">
+      <w:startOverride w:val="1"/>
+    </w:lvlOverride>
+    <w:lvlOverride w:ilvl="4">
+      <w:startOverride w:val="1"/>
+    </w:lvlOverride>
+    <w:lvlOverride w:ilvl="5">
+      <w:startOverride w:val="1"/>
+    </w:lvlOverride>
+    <w:lvlOverride w:ilvl="6">
+      <w:startOverride w:val="1"/>
+    </w:lvlOverride>
+    <w:lvlOverride w:ilvl="7">
+      <w:startOverride w:val="1"/>
+    </w:lvlOverride>
+    <w:lvlOverride w:ilvl="8">
+      <w:startOverride w:val="1"/>
+    </w:lvlOverride>
   </w:num>
   <w:num w:numId="1018">
     <w:abstractNumId w:val="99411"/>
@@ -5140,34 +5236,7 @@
     </w:lvlOverride>
   </w:num>
   <w:num w:numId="1019">
-    <w:abstractNumId w:val="99411"/>
-    <w:lvlOverride w:ilvl="0">
-      <w:startOverride w:val="1"/>
-    </w:lvlOverride>
-    <w:lvlOverride w:ilvl="1">
-      <w:startOverride w:val="1"/>
-    </w:lvlOverride>
-    <w:lvlOverride w:ilvl="2">
-      <w:startOverride w:val="1"/>
-    </w:lvlOverride>
-    <w:lvlOverride w:ilvl="3">
-      <w:startOverride w:val="1"/>
-    </w:lvlOverride>
-    <w:lvlOverride w:ilvl="4">
-      <w:startOverride w:val="1"/>
-    </w:lvlOverride>
-    <w:lvlOverride w:ilvl="5">
-      <w:startOverride w:val="1"/>
-    </w:lvlOverride>
-    <w:lvlOverride w:ilvl="6">
-      <w:startOverride w:val="1"/>
-    </w:lvlOverride>
-    <w:lvlOverride w:ilvl="7">
-      <w:startOverride w:val="1"/>
-    </w:lvlOverride>
-    <w:lvlOverride w:ilvl="8">
-      <w:startOverride w:val="1"/>
-    </w:lvlOverride>
+    <w:abstractNumId w:val="991"/>
   </w:num>
   <w:num w:numId="1020">
     <w:abstractNumId w:val="99411"/>
@@ -5380,34 +5449,7 @@
     </w:lvlOverride>
   </w:num>
   <w:num w:numId="1027">
-    <w:abstractNumId w:val="99411"/>
-    <w:lvlOverride w:ilvl="0">
-      <w:startOverride w:val="1"/>
-    </w:lvlOverride>
-    <w:lvlOverride w:ilvl="1">
-      <w:startOverride w:val="1"/>
-    </w:lvlOverride>
-    <w:lvlOverride w:ilvl="2">
-      <w:startOverride w:val="1"/>
-    </w:lvlOverride>
-    <w:lvlOverride w:ilvl="3">
-      <w:startOverride w:val="1"/>
-    </w:lvlOverride>
-    <w:lvlOverride w:ilvl="4">
-      <w:startOverride w:val="1"/>
-    </w:lvlOverride>
-    <w:lvlOverride w:ilvl="5">
-      <w:startOverride w:val="1"/>
-    </w:lvlOverride>
-    <w:lvlOverride w:ilvl="6">
-      <w:startOverride w:val="1"/>
-    </w:lvlOverride>
-    <w:lvlOverride w:ilvl="7">
-      <w:startOverride w:val="1"/>
-    </w:lvlOverride>
-    <w:lvlOverride w:ilvl="8">
-      <w:startOverride w:val="1"/>
-    </w:lvlOverride>
+    <w:abstractNumId w:val="991"/>
   </w:num>
   <w:num w:numId="1028">
     <w:abstractNumId w:val="99411"/>
@@ -5438,9 +5480,6 @@
     <w:lvlOverride w:ilvl="8">
       <w:startOverride w:val="1"/>
     </w:lvlOverride>
-  </w:num>
-  <w:num w:numId="1029">
-    <w:abstractNumId w:val="991"/>
   </w:num>
 </w:numbering>
 </file>

</xml_diff>